<commit_message>
Checkpoint - Working lora connection over serial, switching to something more efficient and simple
</commit_message>
<xml_diff>
--- a/Notes.docx
+++ b/Notes.docx
@@ -329,76 +329,12 @@
       </w:r>
       <w:proofErr w:type="spellEnd"/>
       <w:r>
-        <w:t xml:space="preserve"> Antenna, GPS Module, and Beam Break trigger. The Timing gate sends and receives TCP messages on port 5000. Sends ETC time of the gate event. Can be paired with multiple gates that also send their trigger time. Each is identified by “Serial” number. </w:t>
-      </w:r>
-      <w:proofErr w:type="gramStart"/>
-      <w:r>
-        <w:t>Server side</w:t>
-      </w:r>
-      <w:proofErr w:type="gramEnd"/>
-      <w:r>
-        <w:t xml:space="preserve"> software logs the raw events in a file for </w:t>
-      </w:r>
-      <w:proofErr w:type="gramStart"/>
-      <w:r>
-        <w:t>autosave</w:t>
-      </w:r>
-      <w:proofErr w:type="gramEnd"/>
-      <w:r>
-        <w:t xml:space="preserve"> ability and calculates sector and lap times from the raw events. Simple labels in a menu will show connected devices and </w:t>
-      </w:r>
-      <w:proofErr w:type="gramStart"/>
-      <w:r>
-        <w:t>allow</w:t>
-      </w:r>
-      <w:proofErr w:type="gramEnd"/>
-      <w:r>
-        <w:t xml:space="preserve"> to select where it is placed. Maybe in the future it’ll show gate locations.</w:t>
-      </w:r>
-    </w:p>
-    <w:p>
-      <w:r>
-        <w:t xml:space="preserve">In the same application I would also like to view the live telemetry of the car. This will consist of a UDP stream of filtered can data. This is in hopes to have a little lag as </w:t>
-      </w:r>
-      <w:proofErr w:type="gramStart"/>
-      <w:r>
-        <w:t>possible, and</w:t>
-      </w:r>
-      <w:proofErr w:type="gramEnd"/>
-      <w:r>
-        <w:t xml:space="preserve"> save </w:t>
-      </w:r>
-      <w:proofErr w:type="gramStart"/>
-      <w:r>
-        <w:t>compute</w:t>
-      </w:r>
-      <w:proofErr w:type="gramEnd"/>
-      <w:r>
-        <w:t xml:space="preserve"> for other functions. This module will also have a GPS antenna that will sync the internal clock and send the GPS coordinates of the car to the server using the same UDP connection. The Server will log </w:t>
-      </w:r>
-      <w:proofErr w:type="gramStart"/>
-      <w:r>
-        <w:t>both of these</w:t>
-      </w:r>
-      <w:proofErr w:type="gramEnd"/>
-      <w:r>
-        <w:t xml:space="preserve"> data streams and </w:t>
-      </w:r>
-      <w:proofErr w:type="gramStart"/>
-      <w:r>
-        <w:t>save</w:t>
-      </w:r>
-      <w:proofErr w:type="gramEnd"/>
-      <w:r>
-        <w:t xml:space="preserve"> to a file. Ideally the server would also graph the coordinates relative to the gates. The server will also send the Timing Gate times and any flags to the car to be transmitted over CAN to the vehicle’s dashboard. Flags will be transmitted as </w:t>
-      </w:r>
-      <w:proofErr w:type="gramStart"/>
-      <w:r>
-        <w:t>a simple integer</w:t>
-      </w:r>
-      <w:proofErr w:type="gramEnd"/>
-      <w:r>
-        <w:t>.</w:t>
+        <w:t xml:space="preserve"> Antenna, GPS Module, and Beam Break trigger. The Timing gate sends and receives TCP messages on port 5000. Sends ETC time of the gate event. Can be paired with multiple gates that also send their trigger time. Each is identified by “Serial” number. Server side software logs the raw events in a file for autosave ability and calculates sector and lap times from the raw events. Simple labels in a menu will show connected devices and allow to select where it is placed. Maybe in the future it’ll show gate locations.</w:t>
+      </w:r>
+    </w:p>
+    <w:p>
+      <w:r>
+        <w:t>In the same application I would also like to view the live telemetry of the car. This will consist of a UDP stream of filtered can data. This is in hopes to have a little lag as possible, and save compute for other functions. This module will also have a GPS antenna that will sync the internal clock and send the GPS coordinates of the car to the server using the same UDP connection. The Server will log both of these data streams and save to a file. Ideally the server would also graph the coordinates relative to the gates. The server will also send the Timing Gate times and any flags to the car to be transmitted over CAN to the vehicle’s dashboard. Flags will be transmitted as a simple integer.</w:t>
       </w:r>
     </w:p>
     <w:p>
@@ -441,23 +377,7 @@
       </w:r>
       <w:proofErr w:type="spellEnd"/>
       <w:r>
-        <w:t xml:space="preserve"> to create a </w:t>
-      </w:r>
-      <w:proofErr w:type="gramStart"/>
-      <w:r>
-        <w:t>high speed</w:t>
-      </w:r>
-      <w:proofErr w:type="gramEnd"/>
-      <w:r>
-        <w:t xml:space="preserve"> uplink. The live telemetry module could also work with just the </w:t>
-      </w:r>
-      <w:proofErr w:type="gramStart"/>
-      <w:r>
-        <w:t>long range</w:t>
-      </w:r>
-      <w:proofErr w:type="gramEnd"/>
-      <w:r>
-        <w:t xml:space="preserve"> link and then I have a separate data logger to micro </w:t>
+        <w:t xml:space="preserve"> to create a high speed uplink. The live telemetry module could also work with just the long range link and then I have a separate data logger to micro </w:t>
       </w:r>
       <w:proofErr w:type="spellStart"/>
       <w:r>
@@ -473,15 +393,7 @@
       </w:r>
       <w:proofErr w:type="spellEnd"/>
       <w:r>
-        <w:t xml:space="preserve"> for </w:t>
-      </w:r>
-      <w:proofErr w:type="gramStart"/>
-      <w:r>
-        <w:t>high speed</w:t>
-      </w:r>
-      <w:proofErr w:type="gramEnd"/>
-      <w:r>
-        <w:t xml:space="preserve"> log starting, stopping, and file transfer.</w:t>
+        <w:t xml:space="preserve"> for high speed log starting, stopping, and file transfer.</w:t>
       </w:r>
     </w:p>
     <w:p/>
@@ -724,15 +636,7 @@
         <w:ind w:firstLine="720"/>
       </w:pPr>
       <w:r>
-        <w:t xml:space="preserve">The UGA Motorsports formula team needed a way to </w:t>
-      </w:r>
-      <w:proofErr w:type="gramStart"/>
-      <w:r>
-        <w:t>accurately</w:t>
-      </w:r>
-      <w:proofErr w:type="gramEnd"/>
-      <w:r>
-        <w:t xml:space="preserve"> time and car during events such as Acceleration and </w:t>
+        <w:t xml:space="preserve">The UGA Motorsports formula team needed a way to accurately time and car during events such as Acceleration and </w:t>
       </w:r>
       <w:proofErr w:type="spellStart"/>
       <w:r>
@@ -740,15 +644,7 @@
       </w:r>
       <w:proofErr w:type="spellEnd"/>
       <w:r>
-        <w:t xml:space="preserve"> as well as </w:t>
-      </w:r>
-      <w:proofErr w:type="gramStart"/>
-      <w:r>
-        <w:t>be</w:t>
-      </w:r>
-      <w:proofErr w:type="gramEnd"/>
-      <w:r>
-        <w:t xml:space="preserve"> able to reliably view vehicle data while driving. Currently the team is using a stopwatch for timing which is quite inaccurate. Not only is the human reaction time slow and inconsistent, but the person cannot be at both the start and finish line, so the point at which they think the car crosses the line could, and normally is, inaccurate. A simple solution to this problem is a beam break timing system, but commercial products are often prohibitively expensive or don’t have the capability to do what the team needs. It would be beneficial to the team if the timing gates were able to be easily combined with engine data for easier analysis after the fact. Additionally, the current live telemetry system on the vehicle is dependent on the ECU, which limits the amount of data and speed at which it can be transmitted. The current system is also not very tolerant of bad connections, leading to it frequently going out.</w:t>
+        <w:t xml:space="preserve"> as well as be able to reliably view vehicle data while driving. Currently the team is using a stopwatch for timing which is quite inaccurate. Not only is the human reaction time slow and inconsistent, but the person cannot be at both the start and finish line, so the point at which they think the car crosses the line could, and normally is, inaccurate. A simple solution to this problem is a beam break timing system, but commercial products are often prohibitively expensive or don’t have the capability to do what the team needs. It would be beneficial to the team if the timing gates were able to be easily combined with engine data for easier analysis after the fact. Additionally, the current live telemetry system on the vehicle is dependent on the ECU, which limits the amount of data and speed at which it can be transmitted. The current system is also not very tolerant of bad connections, leading to it frequently going out.</w:t>
       </w:r>
     </w:p>
     <w:p>
@@ -768,23 +664,7 @@
     <w:p>
       <w:r>
         <w:tab/>
-        <w:t xml:space="preserve">The core principle linking each device together is accurate GPS timing. All data will be sent with the UTC time </w:t>
-      </w:r>
-      <w:proofErr w:type="gramStart"/>
-      <w:r>
-        <w:t>accurate</w:t>
-      </w:r>
-      <w:proofErr w:type="gramEnd"/>
-      <w:r>
-        <w:t xml:space="preserve"> to the millisecond. This will </w:t>
-      </w:r>
-      <w:proofErr w:type="gramStart"/>
-      <w:r>
-        <w:t>used</w:t>
-      </w:r>
-      <w:proofErr w:type="gramEnd"/>
-      <w:r>
-        <w:t xml:space="preserve"> to calculate the time between gate triggers and to combine the engine data with those timing events. When GPS is lost, network time protocol will be used to synchronize the devices.</w:t>
+        <w:t>The core principle linking each device together is accurate GPS timing. All data will be sent with the UTC time accurate to the millisecond. This will used to calculate the time between gate triggers and to combine the engine data with those timing events. When GPS is lost, network time protocol will be used to synchronize the devices.</w:t>
       </w:r>
     </w:p>
     <w:p>
@@ -1384,15 +1264,7 @@
     <w:p/>
     <w:p>
       <w:r>
-        <w:t xml:space="preserve">The above results from the NTP code </w:t>
-      </w:r>
-      <w:proofErr w:type="gramStart"/>
-      <w:r>
-        <w:t>shows</w:t>
-      </w:r>
-      <w:proofErr w:type="gramEnd"/>
-      <w:r>
-        <w:t xml:space="preserve"> normal delay and offset jitter, consistent with other NTP implementations.</w:t>
+        <w:t>The above results from the NTP code shows normal delay and offset jitter, consistent with other NTP implementations.</w:t>
       </w:r>
     </w:p>
     <w:p/>
@@ -1441,15 +1313,7 @@
     </w:p>
     <w:p>
       <w:r>
-        <w:t xml:space="preserve">09:20:42.089 -&gt; 1000005 </w:t>
-      </w:r>
-      <w:proofErr w:type="gramStart"/>
-      <w:r>
-        <w:t xml:space="preserve">  ,</w:t>
-      </w:r>
-      <w:proofErr w:type="gramEnd"/>
-      <w:r>
-        <w:t xml:space="preserve">   999951</w:t>
+        <w:t>09:20:42.089 -&gt; 1000005   ,   999951</w:t>
       </w:r>
     </w:p>
     <w:p>
@@ -1495,15 +1359,7 @@
     </w:p>
     <w:p>
       <w:r>
-        <w:t xml:space="preserve">09:20:43.087 -&gt; 1000007 </w:t>
-      </w:r>
-      <w:proofErr w:type="gramStart"/>
-      <w:r>
-        <w:t xml:space="preserve">  ,</w:t>
-      </w:r>
-      <w:proofErr w:type="gramEnd"/>
-      <w:r>
-        <w:t xml:space="preserve">   999929</w:t>
+        <w:t>09:20:43.087 -&gt; 1000007   ,   999929</w:t>
       </w:r>
     </w:p>
     <w:p>
@@ -1544,15 +1400,7 @@
     </w:p>
     <w:p>
       <w:r>
-        <w:t xml:space="preserve">09:20:44.102 -&gt; 1000007 </w:t>
-      </w:r>
-      <w:proofErr w:type="gramStart"/>
-      <w:r>
-        <w:t xml:space="preserve">  ,</w:t>
-      </w:r>
-      <w:proofErr w:type="gramEnd"/>
-      <w:r>
-        <w:t xml:space="preserve">   999964</w:t>
+        <w:t>09:20:44.102 -&gt; 1000007   ,   999964</w:t>
       </w:r>
     </w:p>
     <w:p>
@@ -1593,15 +1441,7 @@
     </w:p>
     <w:p>
       <w:r>
-        <w:t xml:space="preserve">09:20:45.090 -&gt; 1000006 </w:t>
-      </w:r>
-      <w:proofErr w:type="gramStart"/>
-      <w:r>
-        <w:t xml:space="preserve">  ,</w:t>
-      </w:r>
-      <w:proofErr w:type="gramEnd"/>
-      <w:r>
-        <w:t xml:space="preserve">   999937</w:t>
+        <w:t>09:20:45.090 -&gt; 1000006   ,   999937</w:t>
       </w:r>
     </w:p>
     <w:p>
@@ -1642,15 +1482,7 @@
     </w:p>
     <w:p>
       <w:r>
-        <w:t xml:space="preserve">09:20:46.111 -&gt; 1000006 </w:t>
-      </w:r>
-      <w:proofErr w:type="gramStart"/>
-      <w:r>
-        <w:t xml:space="preserve">  ,</w:t>
-      </w:r>
-      <w:proofErr w:type="gramEnd"/>
-      <w:r>
-        <w:t xml:space="preserve">   1000029</w:t>
+        <w:t>09:20:46.111 -&gt; 1000006   ,   1000029</w:t>
       </w:r>
     </w:p>
     <w:p>
@@ -1671,15 +1503,7 @@
     </w:p>
     <w:p>
       <w:r>
-        <w:t xml:space="preserve">09:20:47.103 -&gt; 1000007 </w:t>
-      </w:r>
-      <w:proofErr w:type="gramStart"/>
-      <w:r>
-        <w:t xml:space="preserve">  ,</w:t>
-      </w:r>
-      <w:proofErr w:type="gramEnd"/>
-      <w:r>
-        <w:t xml:space="preserve">   1000008</w:t>
+        <w:t>09:20:47.103 -&gt; 1000007   ,   1000008</w:t>
       </w:r>
     </w:p>
     <w:p>
@@ -1720,15 +1544,7 @@
     </w:p>
     <w:p>
       <w:r>
-        <w:t xml:space="preserve">09:20:48.105 -&gt; 1000006 </w:t>
-      </w:r>
-      <w:proofErr w:type="gramStart"/>
-      <w:r>
-        <w:t xml:space="preserve">  ,</w:t>
-      </w:r>
-      <w:proofErr w:type="gramEnd"/>
-      <w:r>
-        <w:t xml:space="preserve">   999900</w:t>
+        <w:t>09:20:48.105 -&gt; 1000006   ,   999900</w:t>
       </w:r>
     </w:p>
     <w:p>
@@ -1769,15 +1585,7 @@
     </w:p>
     <w:p>
       <w:r>
-        <w:t xml:space="preserve">09:20:49.076 -&gt; 1000005 </w:t>
-      </w:r>
-      <w:proofErr w:type="gramStart"/>
-      <w:r>
-        <w:t xml:space="preserve">  ,</w:t>
-      </w:r>
-      <w:proofErr w:type="gramEnd"/>
-      <w:r>
-        <w:t xml:space="preserve">   999949</w:t>
+        <w:t>09:20:49.076 -&gt; 1000005   ,   999949</w:t>
       </w:r>
     </w:p>
     <w:p/>
@@ -1792,39 +1600,7 @@
       </w:r>
       <w:proofErr w:type="spellEnd"/>
       <w:r>
-        <w:t xml:space="preserve"> worse than GPS PPS. Just from this quick test </w:t>
-      </w:r>
-      <w:proofErr w:type="gramStart"/>
-      <w:r>
-        <w:t>its</w:t>
-      </w:r>
-      <w:proofErr w:type="gramEnd"/>
-      <w:r>
-        <w:t xml:space="preserve"> around 50 microseconds off every second, which is substantial drift for my application in the timing gates. Time change smoothing is going to be needed, and more research needs to be done to see how well two devices can sync time. </w:t>
-      </w:r>
-      <w:proofErr w:type="gramStart"/>
-      <w:r>
-        <w:t>As long as</w:t>
-      </w:r>
-      <w:proofErr w:type="gramEnd"/>
-      <w:r>
-        <w:t xml:space="preserve"> they can achieve millisecond accuracy then this method will be acceptable. Clock speed correction might also be needed, but </w:t>
-      </w:r>
-      <w:proofErr w:type="gramStart"/>
-      <w:r>
-        <w:t>its</w:t>
-      </w:r>
-      <w:proofErr w:type="gramEnd"/>
-      <w:r>
-        <w:t xml:space="preserve"> </w:t>
-      </w:r>
-      <w:proofErr w:type="gramStart"/>
-      <w:r>
-        <w:t>looking</w:t>
-      </w:r>
-      <w:proofErr w:type="gramEnd"/>
-      <w:r>
-        <w:t xml:space="preserve"> like NTP is too imprecise to do this kind of calculation.</w:t>
+        <w:t xml:space="preserve"> worse than GPS PPS. Just from this quick test its around 50 microseconds off every second, which is substantial drift for my application in the timing gates. Time change smoothing is going to be needed, and more research needs to be done to see how well two devices can sync time. As long as they can achieve millisecond accuracy then this method will be acceptable. Clock speed correction might also be needed, but its looking like NTP is too imprecise to do this kind of calculation.</w:t>
       </w:r>
     </w:p>
     <w:p/>
@@ -2293,15 +2069,7 @@
     </w:p>
     <w:p>
       <w:r>
-        <w:t xml:space="preserve">Uses SPI to communicate, no MCU, Dual Band can transmit at </w:t>
-      </w:r>
-      <w:proofErr w:type="gramStart"/>
-      <w:r>
-        <w:t>sub GHz</w:t>
-      </w:r>
-      <w:proofErr w:type="gramEnd"/>
-      <w:r>
-        <w:t>(915mHz) or 2.4Ghz</w:t>
+        <w:t>Uses SPI to communicate, no MCU, Dual Band can transmit at sub GHz(915mHz) or 2.4Ghz</w:t>
       </w:r>
     </w:p>
     <w:p/>
@@ -2428,23 +2196,7 @@
     </w:p>
     <w:p>
       <w:r>
-        <w:t>RX: +RCV=1,</w:t>
-      </w:r>
-      <w:proofErr w:type="gramStart"/>
-      <w:r>
-        <w:t>12,SEQ</w:t>
-      </w:r>
-      <w:proofErr w:type="gramEnd"/>
-      <w:r>
-        <w:t>=895=</w:t>
-      </w:r>
-      <w:proofErr w:type="gramStart"/>
-      <w:r>
-        <w:t>tttt,-</w:t>
-      </w:r>
-      <w:proofErr w:type="gramEnd"/>
-      <w:r>
-        <w:t>17,14</w:t>
+        <w:t>RX: +RCV=1,12,SEQ=895=tttt,-17,14</w:t>
       </w:r>
     </w:p>
     <w:p>
@@ -2457,15 +2209,7 @@
       </w:r>
       <w:proofErr w:type="spellEnd"/>
       <w:r>
-        <w:t>("AT+PARAMETER=7,9,1,8</w:t>
-      </w:r>
-      <w:proofErr w:type="gramStart"/>
-      <w:r>
-        <w:t>")  #</w:t>
-      </w:r>
-      <w:proofErr w:type="gramEnd"/>
-      <w:r>
-        <w:t xml:space="preserve"> SF7, BW500k, CR4/5, preamble=8</w:t>
+        <w:t>("AT+PARAMETER=7,9,1,8")  # SF7, BW500k, CR4/5, preamble=8</w:t>
       </w:r>
     </w:p>
     <w:p>
@@ -2531,15 +2275,7 @@
     </w:p>
     <w:p>
       <w:r>
-        <w:t>Aka ~</w:t>
-      </w:r>
-      <w:proofErr w:type="gramStart"/>
-      <w:r>
-        <w:t>40 byte</w:t>
-      </w:r>
-      <w:proofErr w:type="gramEnd"/>
-      <w:r>
-        <w:t xml:space="preserve"> message</w:t>
+        <w:t>Aka ~40 byte message</w:t>
       </w:r>
     </w:p>
     <w:p>
@@ -3082,15 +2818,7 @@
         <w:t>to reduce packet size</w:t>
       </w:r>
       <w:r>
-        <w:t xml:space="preserve">. After some implementation, I realized that I should instead send a channel ID, type, and value instead. The length can always be inferred from the type in </w:t>
-      </w:r>
-      <w:proofErr w:type="gramStart"/>
-      <w:r>
-        <w:t>my use</w:t>
-      </w:r>
-      <w:proofErr w:type="gramEnd"/>
-      <w:r>
-        <w:t xml:space="preserve"> case.</w:t>
+        <w:t>. After some implementation, I realized that I should instead send a channel ID, type, and value instead. The length can always be inferred from the type in my use case.</w:t>
       </w:r>
     </w:p>
     <w:p/>
@@ -4274,6 +4002,478 @@
         </w:drawing>
       </w:r>
     </w:p>
+    <w:p>
+      <w:r>
+        <w:rPr>
+          <w:noProof/>
+        </w:rPr>
+        <w:lastRenderedPageBreak/>
+        <w:drawing>
+          <wp:inline distT="0" distB="0" distL="0" distR="0" wp14:anchorId="1F5541EA" wp14:editId="2BAC2FDE">
+            <wp:extent cx="5943600" cy="4128135"/>
+            <wp:effectExtent l="0" t="0" r="0" b="5715"/>
+            <wp:docPr id="1296231376" name="Picture 1"/>
+            <wp:cNvGraphicFramePr>
+              <a:graphicFrameLocks xmlns:a="http://schemas.openxmlformats.org/drawingml/2006/main" noChangeAspect="1"/>
+            </wp:cNvGraphicFramePr>
+            <a:graphic xmlns:a="http://schemas.openxmlformats.org/drawingml/2006/main">
+              <a:graphicData uri="http://schemas.openxmlformats.org/drawingml/2006/picture">
+                <pic:pic xmlns:pic="http://schemas.openxmlformats.org/drawingml/2006/picture">
+                  <pic:nvPicPr>
+                    <pic:cNvPr id="1296231376" name=""/>
+                    <pic:cNvPicPr/>
+                  </pic:nvPicPr>
+                  <pic:blipFill>
+                    <a:blip r:embed="rId29"/>
+                    <a:stretch>
+                      <a:fillRect/>
+                    </a:stretch>
+                  </pic:blipFill>
+                  <pic:spPr>
+                    <a:xfrm>
+                      <a:off x="0" y="0"/>
+                      <a:ext cx="5943600" cy="4128135"/>
+                    </a:xfrm>
+                    <a:prstGeom prst="rect">
+                      <a:avLst/>
+                    </a:prstGeom>
+                  </pic:spPr>
+                </pic:pic>
+              </a:graphicData>
+            </a:graphic>
+          </wp:inline>
+        </w:drawing>
+      </w:r>
+    </w:p>
+    <w:p>
+      <w:r>
+        <w:rPr>
+          <w:noProof/>
+        </w:rPr>
+        <w:drawing>
+          <wp:inline distT="0" distB="0" distL="0" distR="0" wp14:anchorId="63337C90" wp14:editId="7EE2E517">
+            <wp:extent cx="5943600" cy="2767330"/>
+            <wp:effectExtent l="0" t="0" r="0" b="0"/>
+            <wp:docPr id="1353958202" name="Picture 2"/>
+            <wp:cNvGraphicFramePr>
+              <a:graphicFrameLocks xmlns:a="http://schemas.openxmlformats.org/drawingml/2006/main" noChangeAspect="1"/>
+            </wp:cNvGraphicFramePr>
+            <a:graphic xmlns:a="http://schemas.openxmlformats.org/drawingml/2006/main">
+              <a:graphicData uri="http://schemas.openxmlformats.org/drawingml/2006/picture">
+                <pic:pic xmlns:pic="http://schemas.openxmlformats.org/drawingml/2006/picture">
+                  <pic:nvPicPr>
+                    <pic:cNvPr id="1353958202" name="Picture 1353958202"/>
+                    <pic:cNvPicPr/>
+                  </pic:nvPicPr>
+                  <pic:blipFill>
+                    <a:blip r:embed="rId30" cstate="print">
+                      <a:extLst>
+                        <a:ext uri="{28A0092B-C50C-407E-A947-70E740481C1C}">
+                          <a14:useLocalDpi xmlns:a14="http://schemas.microsoft.com/office/drawing/2010/main" val="0"/>
+                        </a:ext>
+                      </a:extLst>
+                    </a:blip>
+                    <a:stretch>
+                      <a:fillRect/>
+                    </a:stretch>
+                  </pic:blipFill>
+                  <pic:spPr>
+                    <a:xfrm>
+                      <a:off x="0" y="0"/>
+                      <a:ext cx="5943600" cy="2767330"/>
+                    </a:xfrm>
+                    <a:prstGeom prst="rect">
+                      <a:avLst/>
+                    </a:prstGeom>
+                  </pic:spPr>
+                </pic:pic>
+              </a:graphicData>
+            </a:graphic>
+          </wp:inline>
+        </w:drawing>
+      </w:r>
+    </w:p>
+    <w:p/>
+    <w:p>
+      <w:r>
+        <w:t>Notes on LoRa Module</w:t>
+      </w:r>
+    </w:p>
+    <w:p>
+      <w:r>
+        <w:lastRenderedPageBreak/>
+        <w:t xml:space="preserve">Library: </w:t>
+      </w:r>
+      <w:r>
+        <w:t>RH_RF95.h</w:t>
+      </w:r>
+      <w:r>
+        <w:t xml:space="preserve">   --  </w:t>
+      </w:r>
+      <w:hyperlink r:id="rId31" w:history="1">
+        <w:r>
+          <w:rPr>
+            <w:rStyle w:val="Hyperlink"/>
+          </w:rPr>
+          <w:t>https://www.airspayce.com/mikem/arduino/RadioHead/classRH__RF95.html#ab9605810c11c025758ea91b2813666e3a1759bc33893056f011b81e62e5c8af5f</w:t>
+        </w:r>
+      </w:hyperlink>
+    </w:p>
+    <w:p>
+      <w:r>
+        <w:t>All messages sent and received by this </w:t>
+      </w:r>
+      <w:hyperlink r:id="rId32" w:tooltip="Driver to send and receive unaddressed, unreliable datagrams via a LoRa capable radio transceiver." w:history="1">
+        <w:r>
+          <w:rPr>
+            <w:rStyle w:val="Hyperlink"/>
+            <w:b/>
+            <w:bCs/>
+          </w:rPr>
+          <w:t>RH_RF95</w:t>
+        </w:r>
+      </w:hyperlink>
+      <w:r>
+        <w:t> Driver conform to this packet format, which is compatible with </w:t>
+      </w:r>
+      <w:hyperlink r:id="rId33" w:tooltip="Driver to send and receive unaddressed, unreliable datagrams via a Semtech SX126X family LoRa capable..." w:history="1">
+        <w:r>
+          <w:rPr>
+            <w:rStyle w:val="Hyperlink"/>
+            <w:b/>
+            <w:bCs/>
+          </w:rPr>
+          <w:t>RH_SX126x</w:t>
+        </w:r>
+      </w:hyperlink>
+      <w:r>
+        <w:t>:</w:t>
+      </w:r>
+    </w:p>
+    <w:p>
+      <w:pPr>
+        <w:numPr>
+          <w:ilvl w:val="0"/>
+          <w:numId w:val="4"/>
+        </w:numPr>
+      </w:pPr>
+      <w:r>
+        <w:t>LoRa mode:</w:t>
+      </w:r>
+    </w:p>
+    <w:p>
+      <w:pPr>
+        <w:numPr>
+          <w:ilvl w:val="0"/>
+          <w:numId w:val="4"/>
+        </w:numPr>
+      </w:pPr>
+      <w:r>
+        <w:t>8 symbol PREAMBLE</w:t>
+      </w:r>
+    </w:p>
+    <w:p>
+      <w:pPr>
+        <w:numPr>
+          <w:ilvl w:val="0"/>
+          <w:numId w:val="4"/>
+        </w:numPr>
+      </w:pPr>
+      <w:r>
+        <w:t>Explicit header with header CRC (default CCITT, handled internally by the radio)</w:t>
+      </w:r>
+    </w:p>
+    <w:p>
+      <w:pPr>
+        <w:numPr>
+          <w:ilvl w:val="0"/>
+          <w:numId w:val="4"/>
+        </w:numPr>
+      </w:pPr>
+      <w:r>
+        <w:t>4 octets HEADER: (TO, FROM, ID, FLAGS)</w:t>
+      </w:r>
+    </w:p>
+    <w:p>
+      <w:pPr>
+        <w:numPr>
+          <w:ilvl w:val="0"/>
+          <w:numId w:val="4"/>
+        </w:numPr>
+      </w:pPr>
+      <w:r>
+        <w:t>0 to 251 octets DATA</w:t>
+      </w:r>
+    </w:p>
+    <w:p>
+      <w:pPr>
+        <w:numPr>
+          <w:ilvl w:val="0"/>
+          <w:numId w:val="4"/>
+        </w:numPr>
+      </w:pPr>
+      <w:r>
+        <w:t>CRC (default CCITT, handled internally by the radio)</w:t>
+      </w:r>
+    </w:p>
+    <w:p>
+      <w:r>
+        <w:t>Inadequate power for the RFM is likely to cause symptoms such as:</w:t>
+      </w:r>
+    </w:p>
+    <w:p>
+      <w:pPr>
+        <w:numPr>
+          <w:ilvl w:val="0"/>
+          <w:numId w:val="5"/>
+        </w:numPr>
+      </w:pPr>
+      <w:r>
+        <w:t>reset's/bootups terminate with "</w:t>
+      </w:r>
+      <w:proofErr w:type="spellStart"/>
+      <w:r>
+        <w:t>init</w:t>
+      </w:r>
+      <w:proofErr w:type="spellEnd"/>
+      <w:r>
+        <w:t xml:space="preserve"> failed" messages</w:t>
+      </w:r>
+    </w:p>
+    <w:p>
+      <w:pPr>
+        <w:numPr>
+          <w:ilvl w:val="0"/>
+          <w:numId w:val="5"/>
+        </w:numPr>
+      </w:pPr>
+      <w:r>
+        <w:t>random termination of communication after 5-30 packets sent/received</w:t>
+      </w:r>
+    </w:p>
+    <w:p>
+      <w:pPr>
+        <w:numPr>
+          <w:ilvl w:val="0"/>
+          <w:numId w:val="5"/>
+        </w:numPr>
+      </w:pPr>
+      <w:r>
+        <w:t>"fake ok" state, where initialization passes fluently, but communication doesn't happen</w:t>
+      </w:r>
+    </w:p>
+    <w:p>
+      <w:pPr>
+        <w:numPr>
+          <w:ilvl w:val="0"/>
+          <w:numId w:val="5"/>
+        </w:numPr>
+      </w:pPr>
+      <w:r>
+        <w:t>shields hang Arduino boards, especially during the flashing</w:t>
+      </w:r>
+    </w:p>
+    <w:p>
+      <w:pPr>
+        <w:rPr>
+          <w:b/>
+          <w:bCs/>
+        </w:rPr>
+      </w:pPr>
+      <w:r>
+        <w:rPr>
+          <w:b/>
+          <w:bCs/>
+        </w:rPr>
+        <w:t>Interrupts</w:t>
+      </w:r>
+    </w:p>
+    <w:p>
+      <w:r>
+        <w:t>The </w:t>
+      </w:r>
+      <w:hyperlink r:id="rId34" w:tooltip="Driver to send and receive unaddressed, unreliable datagrams via a LoRa capable radio transceiver." w:history="1">
+        <w:r>
+          <w:rPr>
+            <w:rStyle w:val="Hyperlink"/>
+            <w:b/>
+            <w:bCs/>
+          </w:rPr>
+          <w:t>RH_RF95</w:t>
+        </w:r>
+      </w:hyperlink>
+      <w:r>
+        <w:t> driver uses interrupts to react to events in the RFM module, such as the reception of a new packet, or the completion of transmission of a packet. The driver configures the radio so the required interrupt is generated by the radio's DIO0 pin. The </w:t>
+      </w:r>
+      <w:hyperlink r:id="rId35" w:tooltip="Driver to send and receive unaddressed, unreliable datagrams via a LoRa capable radio transceiver." w:history="1">
+        <w:r>
+          <w:rPr>
+            <w:rStyle w:val="Hyperlink"/>
+            <w:b/>
+            <w:bCs/>
+          </w:rPr>
+          <w:t>RH_RF95</w:t>
+        </w:r>
+      </w:hyperlink>
+      <w:r>
+        <w:t xml:space="preserve"> driver interrupt service routine reads status from and writes data to the </w:t>
+      </w:r>
+      <w:proofErr w:type="spellStart"/>
+      <w:r>
+        <w:t>the</w:t>
+      </w:r>
+      <w:proofErr w:type="spellEnd"/>
+      <w:r>
+        <w:t xml:space="preserve"> RFM module via the SPI interface. It is very important therefore, that if you are using the </w:t>
+      </w:r>
+      <w:hyperlink r:id="rId36" w:tooltip="Driver to send and receive unaddressed, unreliable datagrams via a LoRa capable radio transceiver." w:history="1">
+        <w:r>
+          <w:rPr>
+            <w:rStyle w:val="Hyperlink"/>
+            <w:b/>
+            <w:bCs/>
+          </w:rPr>
+          <w:t>RH_RF95</w:t>
+        </w:r>
+      </w:hyperlink>
+      <w:r>
+        <w:t xml:space="preserve"> driver with another SPI based </w:t>
+      </w:r>
+      <w:proofErr w:type="spellStart"/>
+      <w:r>
+        <w:t>deviced</w:t>
+      </w:r>
+      <w:proofErr w:type="spellEnd"/>
+      <w:r>
+        <w:t>, that you disable interrupts while you transfer data to and from that other device. Use cli() to disable interrupts and sei() to reenable them.</w:t>
+      </w:r>
+    </w:p>
+    <w:p>
+      <w:pPr>
+        <w:rPr>
+          <w:b/>
+          <w:bCs/>
+        </w:rPr>
+      </w:pPr>
+      <w:r>
+        <w:rPr>
+          <w:b/>
+          <w:bCs/>
+        </w:rPr>
+        <w:t>Memory</w:t>
+      </w:r>
+    </w:p>
+    <w:p>
+      <w:r>
+        <w:t>The </w:t>
+      </w:r>
+      <w:hyperlink r:id="rId37" w:tooltip="Driver to send and receive unaddressed, unreliable datagrams via a LoRa capable radio transceiver." w:history="1">
+        <w:r>
+          <w:rPr>
+            <w:rStyle w:val="Hyperlink"/>
+            <w:b/>
+            <w:bCs/>
+          </w:rPr>
+          <w:t>RH_RF95</w:t>
+        </w:r>
+      </w:hyperlink>
+      <w:r>
+        <w:t xml:space="preserve"> driver requires non-trivial amounts of memory. The sample programs all compile to about 8kbytes each, which will fit in the flash </w:t>
+      </w:r>
+      <w:proofErr w:type="spellStart"/>
+      <w:r>
+        <w:t>proram</w:t>
+      </w:r>
+      <w:proofErr w:type="spellEnd"/>
+      <w:r>
+        <w:t xml:space="preserve"> memory of most Arduinos. </w:t>
+      </w:r>
+      <w:r>
+        <w:lastRenderedPageBreak/>
+        <w:t>However, the RAM requirements are more critical. Therefore, you should be vary sparing with RAM use in programs that use the </w:t>
+      </w:r>
+      <w:hyperlink r:id="rId38" w:tooltip="Driver to send and receive unaddressed, unreliable datagrams via a LoRa capable radio transceiver." w:history="1">
+        <w:r>
+          <w:rPr>
+            <w:rStyle w:val="Hyperlink"/>
+            <w:b/>
+            <w:bCs/>
+          </w:rPr>
+          <w:t>RH_RF95</w:t>
+        </w:r>
+      </w:hyperlink>
+      <w:r>
+        <w:t> driver.</w:t>
+      </w:r>
+    </w:p>
+    <w:p>
+      <w:r>
+        <w:t>It is often hard to accurately identify when you are hitting RAM limits on Arduino. The symptoms can include:</w:t>
+      </w:r>
+    </w:p>
+    <w:p>
+      <w:pPr>
+        <w:numPr>
+          <w:ilvl w:val="0"/>
+          <w:numId w:val="6"/>
+        </w:numPr>
+      </w:pPr>
+      <w:r>
+        <w:t>Mysterious crashes and restarts</w:t>
+      </w:r>
+    </w:p>
+    <w:p>
+      <w:pPr>
+        <w:numPr>
+          <w:ilvl w:val="0"/>
+          <w:numId w:val="6"/>
+        </w:numPr>
+      </w:pPr>
+      <w:r>
+        <w:t xml:space="preserve">Changes in </w:t>
+      </w:r>
+      <w:proofErr w:type="spellStart"/>
+      <w:r>
+        <w:t>behaviour</w:t>
+      </w:r>
+      <w:proofErr w:type="spellEnd"/>
+      <w:r>
+        <w:t xml:space="preserve"> when seemingly unrelated changes are made (such as adding print() statements)</w:t>
+      </w:r>
+    </w:p>
+    <w:p>
+      <w:pPr>
+        <w:numPr>
+          <w:ilvl w:val="0"/>
+          <w:numId w:val="6"/>
+        </w:numPr>
+      </w:pPr>
+      <w:r>
+        <w:t>Hanging</w:t>
+      </w:r>
+    </w:p>
+    <w:p>
+      <w:pPr>
+        <w:numPr>
+          <w:ilvl w:val="0"/>
+          <w:numId w:val="6"/>
+        </w:numPr>
+      </w:pPr>
+      <w:r>
+        <w:t xml:space="preserve">Output from </w:t>
+      </w:r>
+      <w:proofErr w:type="spellStart"/>
+      <w:r>
+        <w:t>Serial.print</w:t>
+      </w:r>
+      <w:proofErr w:type="spellEnd"/>
+      <w:r>
+        <w:t>() not appearing</w:t>
+      </w:r>
+    </w:p>
+    <w:p/>
+    <w:p/>
+    <w:p/>
     <w:sectPr>
       <w:pgSz w:w="12240" w:h="15840"/>
       <w:pgMar w:top="1440" w:right="1440" w:bottom="1440" w:left="1440" w:header="720" w:footer="720" w:gutter="0"/>
@@ -4400,9 +4600,9 @@
     </w:lvl>
   </w:abstractNum>
   <w:abstractNum w:abstractNumId="1" w15:restartNumberingAfterBreak="0">
-    <w:nsid w:val="15673D02"/>
+    <w:nsid w:val="08C4002B"/>
     <w:multiLevelType w:val="multilevel"/>
-    <w:tmpl w:val="78527CEC"/>
+    <w:tmpl w:val="330E1856"/>
     <w:lvl w:ilvl="0">
       <w:start w:val="1"/>
       <w:numFmt w:val="bullet"/>
@@ -4549,9 +4749,9 @@
     </w:lvl>
   </w:abstractNum>
   <w:abstractNum w:abstractNumId="2" w15:restartNumberingAfterBreak="0">
-    <w:nsid w:val="63643030"/>
+    <w:nsid w:val="15673D02"/>
     <w:multiLevelType w:val="multilevel"/>
-    <w:tmpl w:val="CA92BF2A"/>
+    <w:tmpl w:val="78527CEC"/>
     <w:lvl w:ilvl="0">
       <w:start w:val="1"/>
       <w:numFmt w:val="bullet"/>
@@ -4697,14 +4897,470 @@
       </w:rPr>
     </w:lvl>
   </w:abstractNum>
+  <w:abstractNum w:abstractNumId="3" w15:restartNumberingAfterBreak="0">
+    <w:nsid w:val="1B2057E4"/>
+    <w:multiLevelType w:val="multilevel"/>
+    <w:tmpl w:val="27C29FB6"/>
+    <w:lvl w:ilvl="0">
+      <w:start w:val="1"/>
+      <w:numFmt w:val="bullet"/>
+      <w:lvlText w:val=""/>
+      <w:lvlJc w:val="left"/>
+      <w:pPr>
+        <w:tabs>
+          <w:tab w:val="num" w:pos="720"/>
+        </w:tabs>
+        <w:ind w:left="720" w:hanging="360"/>
+      </w:pPr>
+      <w:rPr>
+        <w:rFonts w:ascii="Symbol" w:hAnsi="Symbol" w:hint="default"/>
+        <w:sz w:val="20"/>
+      </w:rPr>
+    </w:lvl>
+    <w:lvl w:ilvl="1" w:tentative="1">
+      <w:start w:val="1"/>
+      <w:numFmt w:val="bullet"/>
+      <w:lvlText w:val="o"/>
+      <w:lvlJc w:val="left"/>
+      <w:pPr>
+        <w:tabs>
+          <w:tab w:val="num" w:pos="1440"/>
+        </w:tabs>
+        <w:ind w:left="1440" w:hanging="360"/>
+      </w:pPr>
+      <w:rPr>
+        <w:rFonts w:ascii="Courier New" w:hAnsi="Courier New" w:hint="default"/>
+        <w:sz w:val="20"/>
+      </w:rPr>
+    </w:lvl>
+    <w:lvl w:ilvl="2" w:tentative="1">
+      <w:start w:val="1"/>
+      <w:numFmt w:val="bullet"/>
+      <w:lvlText w:val=""/>
+      <w:lvlJc w:val="left"/>
+      <w:pPr>
+        <w:tabs>
+          <w:tab w:val="num" w:pos="2160"/>
+        </w:tabs>
+        <w:ind w:left="2160" w:hanging="360"/>
+      </w:pPr>
+      <w:rPr>
+        <w:rFonts w:ascii="Wingdings" w:hAnsi="Wingdings" w:hint="default"/>
+        <w:sz w:val="20"/>
+      </w:rPr>
+    </w:lvl>
+    <w:lvl w:ilvl="3" w:tentative="1">
+      <w:start w:val="1"/>
+      <w:numFmt w:val="bullet"/>
+      <w:lvlText w:val=""/>
+      <w:lvlJc w:val="left"/>
+      <w:pPr>
+        <w:tabs>
+          <w:tab w:val="num" w:pos="2880"/>
+        </w:tabs>
+        <w:ind w:left="2880" w:hanging="360"/>
+      </w:pPr>
+      <w:rPr>
+        <w:rFonts w:ascii="Wingdings" w:hAnsi="Wingdings" w:hint="default"/>
+        <w:sz w:val="20"/>
+      </w:rPr>
+    </w:lvl>
+    <w:lvl w:ilvl="4" w:tentative="1">
+      <w:start w:val="1"/>
+      <w:numFmt w:val="bullet"/>
+      <w:lvlText w:val=""/>
+      <w:lvlJc w:val="left"/>
+      <w:pPr>
+        <w:tabs>
+          <w:tab w:val="num" w:pos="3600"/>
+        </w:tabs>
+        <w:ind w:left="3600" w:hanging="360"/>
+      </w:pPr>
+      <w:rPr>
+        <w:rFonts w:ascii="Wingdings" w:hAnsi="Wingdings" w:hint="default"/>
+        <w:sz w:val="20"/>
+      </w:rPr>
+    </w:lvl>
+    <w:lvl w:ilvl="5" w:tentative="1">
+      <w:start w:val="1"/>
+      <w:numFmt w:val="bullet"/>
+      <w:lvlText w:val=""/>
+      <w:lvlJc w:val="left"/>
+      <w:pPr>
+        <w:tabs>
+          <w:tab w:val="num" w:pos="4320"/>
+        </w:tabs>
+        <w:ind w:left="4320" w:hanging="360"/>
+      </w:pPr>
+      <w:rPr>
+        <w:rFonts w:ascii="Wingdings" w:hAnsi="Wingdings" w:hint="default"/>
+        <w:sz w:val="20"/>
+      </w:rPr>
+    </w:lvl>
+    <w:lvl w:ilvl="6" w:tentative="1">
+      <w:start w:val="1"/>
+      <w:numFmt w:val="bullet"/>
+      <w:lvlText w:val=""/>
+      <w:lvlJc w:val="left"/>
+      <w:pPr>
+        <w:tabs>
+          <w:tab w:val="num" w:pos="5040"/>
+        </w:tabs>
+        <w:ind w:left="5040" w:hanging="360"/>
+      </w:pPr>
+      <w:rPr>
+        <w:rFonts w:ascii="Wingdings" w:hAnsi="Wingdings" w:hint="default"/>
+        <w:sz w:val="20"/>
+      </w:rPr>
+    </w:lvl>
+    <w:lvl w:ilvl="7" w:tentative="1">
+      <w:start w:val="1"/>
+      <w:numFmt w:val="bullet"/>
+      <w:lvlText w:val=""/>
+      <w:lvlJc w:val="left"/>
+      <w:pPr>
+        <w:tabs>
+          <w:tab w:val="num" w:pos="5760"/>
+        </w:tabs>
+        <w:ind w:left="5760" w:hanging="360"/>
+      </w:pPr>
+      <w:rPr>
+        <w:rFonts w:ascii="Wingdings" w:hAnsi="Wingdings" w:hint="default"/>
+        <w:sz w:val="20"/>
+      </w:rPr>
+    </w:lvl>
+    <w:lvl w:ilvl="8" w:tentative="1">
+      <w:start w:val="1"/>
+      <w:numFmt w:val="bullet"/>
+      <w:lvlText w:val=""/>
+      <w:lvlJc w:val="left"/>
+      <w:pPr>
+        <w:tabs>
+          <w:tab w:val="num" w:pos="6480"/>
+        </w:tabs>
+        <w:ind w:left="6480" w:hanging="360"/>
+      </w:pPr>
+      <w:rPr>
+        <w:rFonts w:ascii="Wingdings" w:hAnsi="Wingdings" w:hint="default"/>
+        <w:sz w:val="20"/>
+      </w:rPr>
+    </w:lvl>
+  </w:abstractNum>
+  <w:abstractNum w:abstractNumId="4" w15:restartNumberingAfterBreak="0">
+    <w:nsid w:val="34BA0056"/>
+    <w:multiLevelType w:val="multilevel"/>
+    <w:tmpl w:val="2E70DF0A"/>
+    <w:lvl w:ilvl="0">
+      <w:start w:val="1"/>
+      <w:numFmt w:val="bullet"/>
+      <w:lvlText w:val=""/>
+      <w:lvlJc w:val="left"/>
+      <w:pPr>
+        <w:tabs>
+          <w:tab w:val="num" w:pos="720"/>
+        </w:tabs>
+        <w:ind w:left="720" w:hanging="360"/>
+      </w:pPr>
+      <w:rPr>
+        <w:rFonts w:ascii="Symbol" w:hAnsi="Symbol" w:hint="default"/>
+        <w:sz w:val="20"/>
+      </w:rPr>
+    </w:lvl>
+    <w:lvl w:ilvl="1" w:tentative="1">
+      <w:start w:val="1"/>
+      <w:numFmt w:val="bullet"/>
+      <w:lvlText w:val="o"/>
+      <w:lvlJc w:val="left"/>
+      <w:pPr>
+        <w:tabs>
+          <w:tab w:val="num" w:pos="1440"/>
+        </w:tabs>
+        <w:ind w:left="1440" w:hanging="360"/>
+      </w:pPr>
+      <w:rPr>
+        <w:rFonts w:ascii="Courier New" w:hAnsi="Courier New" w:hint="default"/>
+        <w:sz w:val="20"/>
+      </w:rPr>
+    </w:lvl>
+    <w:lvl w:ilvl="2" w:tentative="1">
+      <w:start w:val="1"/>
+      <w:numFmt w:val="bullet"/>
+      <w:lvlText w:val=""/>
+      <w:lvlJc w:val="left"/>
+      <w:pPr>
+        <w:tabs>
+          <w:tab w:val="num" w:pos="2160"/>
+        </w:tabs>
+        <w:ind w:left="2160" w:hanging="360"/>
+      </w:pPr>
+      <w:rPr>
+        <w:rFonts w:ascii="Wingdings" w:hAnsi="Wingdings" w:hint="default"/>
+        <w:sz w:val="20"/>
+      </w:rPr>
+    </w:lvl>
+    <w:lvl w:ilvl="3" w:tentative="1">
+      <w:start w:val="1"/>
+      <w:numFmt w:val="bullet"/>
+      <w:lvlText w:val=""/>
+      <w:lvlJc w:val="left"/>
+      <w:pPr>
+        <w:tabs>
+          <w:tab w:val="num" w:pos="2880"/>
+        </w:tabs>
+        <w:ind w:left="2880" w:hanging="360"/>
+      </w:pPr>
+      <w:rPr>
+        <w:rFonts w:ascii="Wingdings" w:hAnsi="Wingdings" w:hint="default"/>
+        <w:sz w:val="20"/>
+      </w:rPr>
+    </w:lvl>
+    <w:lvl w:ilvl="4" w:tentative="1">
+      <w:start w:val="1"/>
+      <w:numFmt w:val="bullet"/>
+      <w:lvlText w:val=""/>
+      <w:lvlJc w:val="left"/>
+      <w:pPr>
+        <w:tabs>
+          <w:tab w:val="num" w:pos="3600"/>
+        </w:tabs>
+        <w:ind w:left="3600" w:hanging="360"/>
+      </w:pPr>
+      <w:rPr>
+        <w:rFonts w:ascii="Wingdings" w:hAnsi="Wingdings" w:hint="default"/>
+        <w:sz w:val="20"/>
+      </w:rPr>
+    </w:lvl>
+    <w:lvl w:ilvl="5" w:tentative="1">
+      <w:start w:val="1"/>
+      <w:numFmt w:val="bullet"/>
+      <w:lvlText w:val=""/>
+      <w:lvlJc w:val="left"/>
+      <w:pPr>
+        <w:tabs>
+          <w:tab w:val="num" w:pos="4320"/>
+        </w:tabs>
+        <w:ind w:left="4320" w:hanging="360"/>
+      </w:pPr>
+      <w:rPr>
+        <w:rFonts w:ascii="Wingdings" w:hAnsi="Wingdings" w:hint="default"/>
+        <w:sz w:val="20"/>
+      </w:rPr>
+    </w:lvl>
+    <w:lvl w:ilvl="6" w:tentative="1">
+      <w:start w:val="1"/>
+      <w:numFmt w:val="bullet"/>
+      <w:lvlText w:val=""/>
+      <w:lvlJc w:val="left"/>
+      <w:pPr>
+        <w:tabs>
+          <w:tab w:val="num" w:pos="5040"/>
+        </w:tabs>
+        <w:ind w:left="5040" w:hanging="360"/>
+      </w:pPr>
+      <w:rPr>
+        <w:rFonts w:ascii="Wingdings" w:hAnsi="Wingdings" w:hint="default"/>
+        <w:sz w:val="20"/>
+      </w:rPr>
+    </w:lvl>
+    <w:lvl w:ilvl="7" w:tentative="1">
+      <w:start w:val="1"/>
+      <w:numFmt w:val="bullet"/>
+      <w:lvlText w:val=""/>
+      <w:lvlJc w:val="left"/>
+      <w:pPr>
+        <w:tabs>
+          <w:tab w:val="num" w:pos="5760"/>
+        </w:tabs>
+        <w:ind w:left="5760" w:hanging="360"/>
+      </w:pPr>
+      <w:rPr>
+        <w:rFonts w:ascii="Wingdings" w:hAnsi="Wingdings" w:hint="default"/>
+        <w:sz w:val="20"/>
+      </w:rPr>
+    </w:lvl>
+    <w:lvl w:ilvl="8" w:tentative="1">
+      <w:start w:val="1"/>
+      <w:numFmt w:val="bullet"/>
+      <w:lvlText w:val=""/>
+      <w:lvlJc w:val="left"/>
+      <w:pPr>
+        <w:tabs>
+          <w:tab w:val="num" w:pos="6480"/>
+        </w:tabs>
+        <w:ind w:left="6480" w:hanging="360"/>
+      </w:pPr>
+      <w:rPr>
+        <w:rFonts w:ascii="Wingdings" w:hAnsi="Wingdings" w:hint="default"/>
+        <w:sz w:val="20"/>
+      </w:rPr>
+    </w:lvl>
+  </w:abstractNum>
+  <w:abstractNum w:abstractNumId="5" w15:restartNumberingAfterBreak="0">
+    <w:nsid w:val="63643030"/>
+    <w:multiLevelType w:val="multilevel"/>
+    <w:tmpl w:val="CA92BF2A"/>
+    <w:lvl w:ilvl="0">
+      <w:start w:val="1"/>
+      <w:numFmt w:val="bullet"/>
+      <w:lvlText w:val=""/>
+      <w:lvlJc w:val="left"/>
+      <w:pPr>
+        <w:tabs>
+          <w:tab w:val="num" w:pos="720"/>
+        </w:tabs>
+        <w:ind w:left="720" w:hanging="360"/>
+      </w:pPr>
+      <w:rPr>
+        <w:rFonts w:ascii="Symbol" w:hAnsi="Symbol" w:hint="default"/>
+        <w:sz w:val="20"/>
+      </w:rPr>
+    </w:lvl>
+    <w:lvl w:ilvl="1" w:tentative="1">
+      <w:start w:val="1"/>
+      <w:numFmt w:val="bullet"/>
+      <w:lvlText w:val="o"/>
+      <w:lvlJc w:val="left"/>
+      <w:pPr>
+        <w:tabs>
+          <w:tab w:val="num" w:pos="1440"/>
+        </w:tabs>
+        <w:ind w:left="1440" w:hanging="360"/>
+      </w:pPr>
+      <w:rPr>
+        <w:rFonts w:ascii="Courier New" w:hAnsi="Courier New" w:hint="default"/>
+        <w:sz w:val="20"/>
+      </w:rPr>
+    </w:lvl>
+    <w:lvl w:ilvl="2" w:tentative="1">
+      <w:start w:val="1"/>
+      <w:numFmt w:val="bullet"/>
+      <w:lvlText w:val=""/>
+      <w:lvlJc w:val="left"/>
+      <w:pPr>
+        <w:tabs>
+          <w:tab w:val="num" w:pos="2160"/>
+        </w:tabs>
+        <w:ind w:left="2160" w:hanging="360"/>
+      </w:pPr>
+      <w:rPr>
+        <w:rFonts w:ascii="Wingdings" w:hAnsi="Wingdings" w:hint="default"/>
+        <w:sz w:val="20"/>
+      </w:rPr>
+    </w:lvl>
+    <w:lvl w:ilvl="3" w:tentative="1">
+      <w:start w:val="1"/>
+      <w:numFmt w:val="bullet"/>
+      <w:lvlText w:val=""/>
+      <w:lvlJc w:val="left"/>
+      <w:pPr>
+        <w:tabs>
+          <w:tab w:val="num" w:pos="2880"/>
+        </w:tabs>
+        <w:ind w:left="2880" w:hanging="360"/>
+      </w:pPr>
+      <w:rPr>
+        <w:rFonts w:ascii="Wingdings" w:hAnsi="Wingdings" w:hint="default"/>
+        <w:sz w:val="20"/>
+      </w:rPr>
+    </w:lvl>
+    <w:lvl w:ilvl="4" w:tentative="1">
+      <w:start w:val="1"/>
+      <w:numFmt w:val="bullet"/>
+      <w:lvlText w:val=""/>
+      <w:lvlJc w:val="left"/>
+      <w:pPr>
+        <w:tabs>
+          <w:tab w:val="num" w:pos="3600"/>
+        </w:tabs>
+        <w:ind w:left="3600" w:hanging="360"/>
+      </w:pPr>
+      <w:rPr>
+        <w:rFonts w:ascii="Wingdings" w:hAnsi="Wingdings" w:hint="default"/>
+        <w:sz w:val="20"/>
+      </w:rPr>
+    </w:lvl>
+    <w:lvl w:ilvl="5" w:tentative="1">
+      <w:start w:val="1"/>
+      <w:numFmt w:val="bullet"/>
+      <w:lvlText w:val=""/>
+      <w:lvlJc w:val="left"/>
+      <w:pPr>
+        <w:tabs>
+          <w:tab w:val="num" w:pos="4320"/>
+        </w:tabs>
+        <w:ind w:left="4320" w:hanging="360"/>
+      </w:pPr>
+      <w:rPr>
+        <w:rFonts w:ascii="Wingdings" w:hAnsi="Wingdings" w:hint="default"/>
+        <w:sz w:val="20"/>
+      </w:rPr>
+    </w:lvl>
+    <w:lvl w:ilvl="6" w:tentative="1">
+      <w:start w:val="1"/>
+      <w:numFmt w:val="bullet"/>
+      <w:lvlText w:val=""/>
+      <w:lvlJc w:val="left"/>
+      <w:pPr>
+        <w:tabs>
+          <w:tab w:val="num" w:pos="5040"/>
+        </w:tabs>
+        <w:ind w:left="5040" w:hanging="360"/>
+      </w:pPr>
+      <w:rPr>
+        <w:rFonts w:ascii="Wingdings" w:hAnsi="Wingdings" w:hint="default"/>
+        <w:sz w:val="20"/>
+      </w:rPr>
+    </w:lvl>
+    <w:lvl w:ilvl="7" w:tentative="1">
+      <w:start w:val="1"/>
+      <w:numFmt w:val="bullet"/>
+      <w:lvlText w:val=""/>
+      <w:lvlJc w:val="left"/>
+      <w:pPr>
+        <w:tabs>
+          <w:tab w:val="num" w:pos="5760"/>
+        </w:tabs>
+        <w:ind w:left="5760" w:hanging="360"/>
+      </w:pPr>
+      <w:rPr>
+        <w:rFonts w:ascii="Wingdings" w:hAnsi="Wingdings" w:hint="default"/>
+        <w:sz w:val="20"/>
+      </w:rPr>
+    </w:lvl>
+    <w:lvl w:ilvl="8" w:tentative="1">
+      <w:start w:val="1"/>
+      <w:numFmt w:val="bullet"/>
+      <w:lvlText w:val=""/>
+      <w:lvlJc w:val="left"/>
+      <w:pPr>
+        <w:tabs>
+          <w:tab w:val="num" w:pos="6480"/>
+        </w:tabs>
+        <w:ind w:left="6480" w:hanging="360"/>
+      </w:pPr>
+      <w:rPr>
+        <w:rFonts w:ascii="Wingdings" w:hAnsi="Wingdings" w:hint="default"/>
+        <w:sz w:val="20"/>
+      </w:rPr>
+    </w:lvl>
+  </w:abstractNum>
   <w:num w:numId="1" w16cid:durableId="1943147990">
-    <w:abstractNumId w:val="1"/>
+    <w:abstractNumId w:val="2"/>
   </w:num>
   <w:num w:numId="2" w16cid:durableId="728580642">
-    <w:abstractNumId w:val="2"/>
+    <w:abstractNumId w:val="5"/>
   </w:num>
   <w:num w:numId="3" w16cid:durableId="235096502">
     <w:abstractNumId w:val="0"/>
+  </w:num>
+  <w:num w:numId="4" w16cid:durableId="262081099">
+    <w:abstractNumId w:val="4"/>
+  </w:num>
+  <w:num w:numId="5" w16cid:durableId="1109620413">
+    <w:abstractNumId w:val="3"/>
+  </w:num>
+  <w:num w:numId="6" w16cid:durableId="251663724">
+    <w:abstractNumId w:val="1"/>
   </w:num>
 </w:numbering>
 </file>
@@ -5312,7 +5968,6 @@
   <w:style w:type="character" w:default="1" w:styleId="DefaultParagraphFont">
     <w:name w:val="Default Paragraph Font"/>
     <w:uiPriority w:val="1"/>
-    <w:semiHidden/>
     <w:unhideWhenUsed/>
   </w:style>
   <w:style w:type="table" w:default="1" w:styleId="TableNormal">

</xml_diff>

<commit_message>
Made datalogging and ring buffer much better but def not perfect. now able to log at high rates without blocking
</commit_message>
<xml_diff>
--- a/Notes.docx
+++ b/Notes.docx
@@ -152,23 +152,13 @@
     <w:p/>
     <w:p>
       <w:r>
-        <w:t xml:space="preserve">1ms accuracy with lap times &lt;1minute or with </w:t>
-      </w:r>
-      <w:proofErr w:type="spellStart"/>
-      <w:r>
-        <w:t>gps</w:t>
-      </w:r>
-      <w:proofErr w:type="spellEnd"/>
-    </w:p>
-    <w:p>
-      <w:r>
-        <w:t xml:space="preserve">10ms accuracy with lap times &gt;1minute and no </w:t>
-      </w:r>
-      <w:proofErr w:type="spellStart"/>
-      <w:r>
-        <w:t>gps</w:t>
-      </w:r>
-      <w:proofErr w:type="spellEnd"/>
+        <w:t>1ms accuracy with lap times &lt;1minute or with gps</w:t>
+      </w:r>
+    </w:p>
+    <w:p>
+      <w:r>
+        <w:t>10ms accuracy with lap times &gt;1minute and no gps</w:t>
+      </w:r>
     </w:p>
     <w:p/>
     <w:p/>
@@ -306,15 +296,7 @@
     </w:p>
     <w:p>
       <w:r>
-        <w:t xml:space="preserve">The Timing Gate will have a </w:t>
-      </w:r>
-      <w:proofErr w:type="spellStart"/>
-      <w:r>
-        <w:t>Wifi</w:t>
-      </w:r>
-      <w:proofErr w:type="spellEnd"/>
-      <w:r>
-        <w:t xml:space="preserve"> Antenna, GPS Module, and Beam Break trigger. The Timing gate sends and receives TCP messages on port 5000. Sends ETC time of the gate event. Can be paired with multiple gates that also send their trigger time. Each is identified by “Serial” number. Server side software logs the raw events in a file for autosave ability and calculates sector and lap times from the raw events. Simple labels in a menu will show connected devices and allow to select where it is placed. Maybe in the future it’ll show gate locations.</w:t>
+        <w:t>The Timing Gate will have a Wifi Antenna, GPS Module, and Beam Break trigger. The Timing gate sends and receives TCP messages on port 5000. Sends ETC time of the gate event. Can be paired with multiple gates that also send their trigger time. Each is identified by “Serial” number. Server side software logs the raw events in a file for autosave ability and calculates sector and lap times from the raw events. Simple labels in a menu will show connected devices and allow to select where it is placed. Maybe in the future it’ll show gate locations.</w:t>
       </w:r>
     </w:p>
     <w:p>
@@ -354,31 +336,7 @@
     </w:p>
     <w:p>
       <w:r>
-        <w:t xml:space="preserve">Eventually the wireless link might get switched to a lora system or 900mhz and just use </w:t>
-      </w:r>
-      <w:proofErr w:type="spellStart"/>
-      <w:r>
-        <w:t>wifi</w:t>
-      </w:r>
-      <w:proofErr w:type="spellEnd"/>
-      <w:r>
-        <w:t xml:space="preserve"> to create a high speed uplink. The live telemetry module could also work with just the long range link and then I have a separate data logger to micro </w:t>
-      </w:r>
-      <w:proofErr w:type="spellStart"/>
-      <w:r>
-        <w:t>sd</w:t>
-      </w:r>
-      <w:proofErr w:type="spellEnd"/>
-      <w:r>
-        <w:t xml:space="preserve"> card module that has </w:t>
-      </w:r>
-      <w:proofErr w:type="spellStart"/>
-      <w:r>
-        <w:t>wifi</w:t>
-      </w:r>
-      <w:proofErr w:type="spellEnd"/>
-      <w:r>
-        <w:t xml:space="preserve"> for high speed log starting, stopping, and file transfer.</w:t>
+        <w:t>Eventually the wireless link might get switched to a lora system or 900mhz and just use wifi to create a high speed uplink. The live telemetry module could also work with just the long range link and then I have a separate data logger to micro sd card module that has wifi for high speed log starting, stopping, and file transfer.</w:t>
       </w:r>
     </w:p>
     <w:p/>
@@ -423,13 +381,8 @@
       </w:r>
     </w:p>
     <w:p>
-      <w:proofErr w:type="spellStart"/>
-      <w:r>
-        <w:t>Spi</w:t>
-      </w:r>
-      <w:proofErr w:type="spellEnd"/>
-      <w:r>
-        <w:t xml:space="preserve"> Bus 8,000kbps</w:t>
+      <w:r>
+        <w:t>Spi Bus 8,000kbps</w:t>
       </w:r>
     </w:p>
     <w:p>
@@ -577,13 +530,8 @@
             <w:hideMark/>
           </w:tcPr>
           <w:p>
-            <w:proofErr w:type="spellStart"/>
-            <w:r>
-              <w:t>WiFi</w:t>
-            </w:r>
-            <w:proofErr w:type="spellEnd"/>
-            <w:r>
-              <w:t xml:space="preserve"> UDP 2.4GHz</w:t>
+            <w:r>
+              <w:t>WiFi UDP 2.4GHz</w:t>
             </w:r>
           </w:p>
         </w:tc>
@@ -621,29 +569,13 @@
         <w:ind w:firstLine="720"/>
       </w:pPr>
       <w:r>
-        <w:t xml:space="preserve">The UGA Motorsports formula team needed a way to accurately time and car during events such as Acceleration and </w:t>
-      </w:r>
-      <w:proofErr w:type="spellStart"/>
-      <w:r>
-        <w:t>Autox</w:t>
-      </w:r>
-      <w:proofErr w:type="spellEnd"/>
-      <w:r>
-        <w:t xml:space="preserve"> as well as be able to reliably view vehicle data while driving. Currently the team is using a stopwatch for timing which is quite inaccurate. Not only is the human reaction time slow and inconsistent, but the person cannot be at both the start and finish line, so the point at which they think the car crosses the line could, and normally is, inaccurate. A simple solution to this problem is a beam break timing system, but commercial products are often prohibitively expensive or don’t have the capability to do what the team needs. It would be beneficial to the team if the timing gates were able to be easily combined with engine data for easier analysis after the fact. Additionally, the current live telemetry system on the vehicle is dependent on the ECU, which limits the amount of data and speed at which it can be transmitted. The current system is also not very tolerant of bad connections, leading to it frequently going out.</w:t>
+        <w:t>The UGA Motorsports formula team needed a way to accurately time and car during events such as Acceleration and Autox as well as be able to reliably view vehicle data while driving. Currently the team is using a stopwatch for timing which is quite inaccurate. Not only is the human reaction time slow and inconsistent, but the person cannot be at both the start and finish line, so the point at which they think the car crosses the line could, and normally is, inaccurate. A simple solution to this problem is a beam break timing system, but commercial products are often prohibitively expensive or don’t have the capability to do what the team needs. It would be beneficial to the team if the timing gates were able to be easily combined with engine data for easier analysis after the fact. Additionally, the current live telemetry system on the vehicle is dependent on the ECU, which limits the amount of data and speed at which it can be transmitted. The current system is also not very tolerant of bad connections, leading to it frequently going out.</w:t>
       </w:r>
     </w:p>
     <w:p>
       <w:r>
         <w:tab/>
-        <w:t xml:space="preserve">I propose a system that combines all data acquisition into one convenient system/application that allows data to be quickly saved, viewed, synchronized, and expanded. A vehicle telemetry link capable of up to 2km (The max distance from the pit at Michigan International Speedway) for key engine statistics and timing gates capable of a typical acceleration test, or multiple sectors in an </w:t>
-      </w:r>
-      <w:proofErr w:type="spellStart"/>
-      <w:r>
-        <w:t>Autox</w:t>
-      </w:r>
-      <w:proofErr w:type="spellEnd"/>
-      <w:r>
-        <w:t xml:space="preserve"> test. Additionally, it should be a convenient way to take driver notes, record tire data, and organize test data. This will make testing documentation easier and improve the quality of data collected. Further, it will allow for easier analysis and review of testing data.</w:t>
+        <w:t>I propose a system that combines all data acquisition into one convenient system/application that allows data to be quickly saved, viewed, synchronized, and expanded. A vehicle telemetry link capable of up to 2km (The max distance from the pit at Michigan International Speedway) for key engine statistics and timing gates capable of a typical acceleration test, or multiple sectors in an Autox test. Additionally, it should be a convenient way to take driver notes, record tire data, and organize test data. This will make testing documentation easier and improve the quality of data collected. Further, it will allow for easier analysis and review of testing data.</w:t>
       </w:r>
     </w:p>
     <w:p>
@@ -801,35 +733,14 @@
     </w:p>
     <w:p>
       <w:r>
-        <w:t xml:space="preserve">Recorded on my local home network using an </w:t>
-      </w:r>
-      <w:proofErr w:type="spellStart"/>
-      <w:r>
-        <w:t>Att</w:t>
-      </w:r>
-      <w:proofErr w:type="spellEnd"/>
-      <w:r>
-        <w:t xml:space="preserve"> router. Ping times were verified</w:t>
+        <w:t>Recorded on my local home network using an Att router. Ping times were verified</w:t>
       </w:r>
     </w:p>
     <w:p/>
     <w:p>
       <w:r>
-        <w:t xml:space="preserve">23:30:15.563 -&gt; Sync: offset = 1761103532278201800 ns (1761103532278.202 </w:t>
-      </w:r>
-      <w:proofErr w:type="spellStart"/>
-      <w:r>
-        <w:t>ms</w:t>
-      </w:r>
-      <w:proofErr w:type="spellEnd"/>
-      <w:r>
-        <w:t xml:space="preserve">), delay = 7.950 </w:t>
-      </w:r>
-      <w:proofErr w:type="spellStart"/>
-      <w:r>
-        <w:t>ms</w:t>
-      </w:r>
-      <w:proofErr w:type="spellEnd"/>
+        <w:t>23:30:15.563 -&gt; Sync: offset = 1761103532278201800 ns (1761103532278.202 ms), delay = 7.950 ms</w:t>
+      </w:r>
     </w:p>
     <w:p>
       <w:r>
@@ -843,21 +754,8 @@
     </w:p>
     <w:p>
       <w:r>
-        <w:t xml:space="preserve">23:30:16.592 -&gt; Sync: offset = 1761103532278206970 ns (1761103532278.207 </w:t>
-      </w:r>
-      <w:proofErr w:type="spellStart"/>
-      <w:r>
-        <w:t>ms</w:t>
-      </w:r>
-      <w:proofErr w:type="spellEnd"/>
-      <w:r>
-        <w:t xml:space="preserve">), delay = 10.029 </w:t>
-      </w:r>
-      <w:proofErr w:type="spellStart"/>
-      <w:r>
-        <w:t>ms</w:t>
-      </w:r>
-      <w:proofErr w:type="spellEnd"/>
+        <w:t>23:30:16.592 -&gt; Sync: offset = 1761103532278206970 ns (1761103532278.207 ms), delay = 10.029 ms</w:t>
+      </w:r>
     </w:p>
     <w:p>
       <w:r>
@@ -871,21 +769,8 @@
     </w:p>
     <w:p>
       <w:r>
-        <w:t xml:space="preserve">23:30:17.600 -&gt; Sync: offset = 1761103532278255300 ns (1761103532278.255 </w:t>
-      </w:r>
-      <w:proofErr w:type="spellStart"/>
-      <w:r>
-        <w:t>ms</w:t>
-      </w:r>
-      <w:proofErr w:type="spellEnd"/>
-      <w:r>
-        <w:t xml:space="preserve">), delay = 8.974 </w:t>
-      </w:r>
-      <w:proofErr w:type="spellStart"/>
-      <w:r>
-        <w:t>ms</w:t>
-      </w:r>
-      <w:proofErr w:type="spellEnd"/>
+        <w:t>23:30:17.600 -&gt; Sync: offset = 1761103532278255300 ns (1761103532278.255 ms), delay = 8.974 ms</w:t>
+      </w:r>
     </w:p>
     <w:p>
       <w:r>
@@ -899,21 +784,8 @@
     </w:p>
     <w:p>
       <w:r>
-        <w:t xml:space="preserve">23:30:18.615 -&gt; Sync: offset = 1761103532278233920 ns (1761103532278.234 </w:t>
-      </w:r>
-      <w:proofErr w:type="spellStart"/>
-      <w:r>
-        <w:t>ms</w:t>
-      </w:r>
-      <w:proofErr w:type="spellEnd"/>
-      <w:r>
-        <w:t xml:space="preserve">), delay = 8.975 </w:t>
-      </w:r>
-      <w:proofErr w:type="spellStart"/>
-      <w:r>
-        <w:t>ms</w:t>
-      </w:r>
-      <w:proofErr w:type="spellEnd"/>
+        <w:t>23:30:18.615 -&gt; Sync: offset = 1761103532278233920 ns (1761103532278.234 ms), delay = 8.975 ms</w:t>
+      </w:r>
     </w:p>
     <w:p>
       <w:r>
@@ -927,21 +799,8 @@
     </w:p>
     <w:p>
       <w:r>
-        <w:t xml:space="preserve">23:30:19.604 -&gt; Sync: offset = 1761103532278687040 ns (1761103532278.687 </w:t>
-      </w:r>
-      <w:proofErr w:type="spellStart"/>
-      <w:r>
-        <w:t>ms</w:t>
-      </w:r>
-      <w:proofErr w:type="spellEnd"/>
-      <w:r>
-        <w:t xml:space="preserve">), delay = 13.028 </w:t>
-      </w:r>
-      <w:proofErr w:type="spellStart"/>
-      <w:r>
-        <w:t>ms</w:t>
-      </w:r>
-      <w:proofErr w:type="spellEnd"/>
+        <w:t>23:30:19.604 -&gt; Sync: offset = 1761103532278687040 ns (1761103532278.687 ms), delay = 13.028 ms</w:t>
+      </w:r>
     </w:p>
     <w:p>
       <w:r>
@@ -956,21 +815,8 @@
     </w:p>
     <w:p>
       <w:r>
-        <w:t xml:space="preserve">23:30:20.647 -&gt; Sync: offset = 1761103532278683230 ns (1761103532278.683 </w:t>
-      </w:r>
-      <w:proofErr w:type="spellStart"/>
-      <w:r>
-        <w:t>ms</w:t>
-      </w:r>
-      <w:proofErr w:type="spellEnd"/>
-      <w:r>
-        <w:t xml:space="preserve">), delay = 10.720 </w:t>
-      </w:r>
-      <w:proofErr w:type="spellStart"/>
-      <w:r>
-        <w:t>ms</w:t>
-      </w:r>
-      <w:proofErr w:type="spellEnd"/>
+        <w:t>23:30:20.647 -&gt; Sync: offset = 1761103532278683230 ns (1761103532278.683 ms), delay = 10.720 ms</w:t>
+      </w:r>
     </w:p>
     <w:p>
       <w:r>
@@ -984,21 +830,8 @@
     </w:p>
     <w:p>
       <w:r>
-        <w:t xml:space="preserve">23:30:21.654 -&gt; Sync: offset = 1761103532278558650 ns (1761103532278.559 </w:t>
-      </w:r>
-      <w:proofErr w:type="spellStart"/>
-      <w:r>
-        <w:t>ms</w:t>
-      </w:r>
-      <w:proofErr w:type="spellEnd"/>
-      <w:r>
-        <w:t xml:space="preserve">), delay = 7.984 </w:t>
-      </w:r>
-      <w:proofErr w:type="spellStart"/>
-      <w:r>
-        <w:t>ms</w:t>
-      </w:r>
-      <w:proofErr w:type="spellEnd"/>
+        <w:t>23:30:21.654 -&gt; Sync: offset = 1761103532278558650 ns (1761103532278.559 ms), delay = 7.984 ms</w:t>
+      </w:r>
     </w:p>
     <w:p>
       <w:r>
@@ -1012,21 +845,8 @@
     </w:p>
     <w:p>
       <w:r>
-        <w:t xml:space="preserve">23:30:22.666 -&gt; Sync: offset = 1761103532278294070 ns (1761103532278.294 </w:t>
-      </w:r>
-      <w:proofErr w:type="spellStart"/>
-      <w:r>
-        <w:t>ms</w:t>
-      </w:r>
-      <w:proofErr w:type="spellEnd"/>
-      <w:r>
-        <w:t xml:space="preserve">), delay = 9.001 </w:t>
-      </w:r>
-      <w:proofErr w:type="spellStart"/>
-      <w:r>
-        <w:t>ms</w:t>
-      </w:r>
-      <w:proofErr w:type="spellEnd"/>
+        <w:t>23:30:22.666 -&gt; Sync: offset = 1761103532278294070 ns (1761103532278.294 ms), delay = 9.001 ms</w:t>
+      </w:r>
     </w:p>
     <w:p>
       <w:r>
@@ -1040,21 +860,8 @@
     </w:p>
     <w:p>
       <w:r>
-        <w:t xml:space="preserve">23:30:23.668 -&gt; Sync: offset = 1761103532278233590 ns (1761103532278.234 </w:t>
-      </w:r>
-      <w:proofErr w:type="spellStart"/>
-      <w:r>
-        <w:t>ms</w:t>
-      </w:r>
-      <w:proofErr w:type="spellEnd"/>
-      <w:r>
-        <w:t xml:space="preserve">), delay = 9.057 </w:t>
-      </w:r>
-      <w:proofErr w:type="spellStart"/>
-      <w:r>
-        <w:t>ms</w:t>
-      </w:r>
-      <w:proofErr w:type="spellEnd"/>
+        <w:t>23:30:23.668 -&gt; Sync: offset = 1761103532278233590 ns (1761103532278.234 ms), delay = 9.057 ms</w:t>
+      </w:r>
     </w:p>
     <w:p>
       <w:r>
@@ -1068,21 +875,8 @@
     </w:p>
     <w:p>
       <w:r>
-        <w:t xml:space="preserve">23:30:24.680 -&gt; Sync: offset = 1761103532277973340 ns (1761103532277.973 </w:t>
-      </w:r>
-      <w:proofErr w:type="spellStart"/>
-      <w:r>
-        <w:t>ms</w:t>
-      </w:r>
-      <w:proofErr w:type="spellEnd"/>
-      <w:r>
-        <w:t xml:space="preserve">), delay = 11.028 </w:t>
-      </w:r>
-      <w:proofErr w:type="spellStart"/>
-      <w:r>
-        <w:t>ms</w:t>
-      </w:r>
-      <w:proofErr w:type="spellEnd"/>
+        <w:t>23:30:24.680 -&gt; Sync: offset = 1761103532277973340 ns (1761103532277.973 ms), delay = 11.028 ms</w:t>
+      </w:r>
     </w:p>
     <w:p>
       <w:r>
@@ -1096,21 +890,8 @@
     </w:p>
     <w:p>
       <w:r>
-        <w:t xml:space="preserve">23:30:25.682 -&gt; Sync: offset = 1761103532278371060 ns (1761103532278.371 </w:t>
-      </w:r>
-      <w:proofErr w:type="spellStart"/>
-      <w:r>
-        <w:t>ms</w:t>
-      </w:r>
-      <w:proofErr w:type="spellEnd"/>
-      <w:r>
-        <w:t xml:space="preserve">), delay = 14.058 </w:t>
-      </w:r>
-      <w:proofErr w:type="spellStart"/>
-      <w:r>
-        <w:t>ms</w:t>
-      </w:r>
-      <w:proofErr w:type="spellEnd"/>
+        <w:t>23:30:25.682 -&gt; Sync: offset = 1761103532278371060 ns (1761103532278.371 ms), delay = 14.058 ms</w:t>
+      </w:r>
     </w:p>
     <w:p>
       <w:r>
@@ -1125,21 +906,8 @@
     </w:p>
     <w:p>
       <w:r>
-        <w:t xml:space="preserve">23:30:26.687 -&gt; Sync: offset = 1761103532278007080 ns (1761103532278.007 </w:t>
-      </w:r>
-      <w:proofErr w:type="spellStart"/>
-      <w:r>
-        <w:t>ms</w:t>
-      </w:r>
-      <w:proofErr w:type="spellEnd"/>
-      <w:r>
-        <w:t xml:space="preserve">), delay = 11.508 </w:t>
-      </w:r>
-      <w:proofErr w:type="spellStart"/>
-      <w:r>
-        <w:t>ms</w:t>
-      </w:r>
-      <w:proofErr w:type="spellEnd"/>
+        <w:t>23:30:26.687 -&gt; Sync: offset = 1761103532278007080 ns (1761103532278.007 ms), delay = 11.508 ms</w:t>
+      </w:r>
     </w:p>
     <w:p>
       <w:r>
@@ -1153,21 +921,8 @@
     </w:p>
     <w:p>
       <w:r>
-        <w:t xml:space="preserve">23:30:27.729 -&gt; Sync: offset = 1761103532278125900 ns (1761103532278.126 </w:t>
-      </w:r>
-      <w:proofErr w:type="spellStart"/>
-      <w:r>
-        <w:t>ms</w:t>
-      </w:r>
-      <w:proofErr w:type="spellEnd"/>
-      <w:r>
-        <w:t xml:space="preserve">), delay = 9.061 </w:t>
-      </w:r>
-      <w:proofErr w:type="spellStart"/>
-      <w:r>
-        <w:t>ms</w:t>
-      </w:r>
-      <w:proofErr w:type="spellEnd"/>
+        <w:t>23:30:27.729 -&gt; Sync: offset = 1761103532278125900 ns (1761103532278.126 ms), delay = 9.061 ms</w:t>
+      </w:r>
     </w:p>
     <w:p>
       <w:r>
@@ -1181,21 +936,8 @@
     </w:p>
     <w:p>
       <w:r>
-        <w:t xml:space="preserve">23:30:28.736 -&gt; Sync: offset = 1761103532277785260 ns (1761103532277.785 </w:t>
-      </w:r>
-      <w:proofErr w:type="spellStart"/>
-      <w:r>
-        <w:t>ms</w:t>
-      </w:r>
-      <w:proofErr w:type="spellEnd"/>
-      <w:r>
-        <w:t xml:space="preserve">), delay = 10.694 </w:t>
-      </w:r>
-      <w:proofErr w:type="spellStart"/>
-      <w:r>
-        <w:t>ms</w:t>
-      </w:r>
-      <w:proofErr w:type="spellEnd"/>
+        <w:t>23:30:28.736 -&gt; Sync: offset = 1761103532277785260 ns (1761103532277.785 ms), delay = 10.694 ms</w:t>
+      </w:r>
     </w:p>
     <w:p>
       <w:r>
@@ -1209,21 +951,8 @@
     </w:p>
     <w:p>
       <w:r>
-        <w:t xml:space="preserve">23:30:29.758 -&gt; Sync: offset = 1761103532277498740 ns (1761103532277.499 </w:t>
-      </w:r>
-      <w:proofErr w:type="spellStart"/>
-      <w:r>
-        <w:t>ms</w:t>
-      </w:r>
-      <w:proofErr w:type="spellEnd"/>
-      <w:r>
-        <w:t xml:space="preserve">), delay = 9.159 </w:t>
-      </w:r>
-      <w:proofErr w:type="spellStart"/>
-      <w:r>
-        <w:t>ms</w:t>
-      </w:r>
-      <w:proofErr w:type="spellEnd"/>
+        <w:t>23:30:29.758 -&gt; Sync: offset = 1761103532277498740 ns (1761103532277.499 ms), delay = 9.159 ms</w:t>
+      </w:r>
     </w:p>
     <w:p>
       <w:r>
@@ -1262,29 +991,8 @@
         <w:br/>
       </w:r>
       <w:r>
-        <w:t xml:space="preserve">09:20:41.858 -&gt; Sync: offset=1761311994438.293 </w:t>
-      </w:r>
-      <w:proofErr w:type="spellStart"/>
-      <w:r>
-        <w:t>ms</w:t>
-      </w:r>
-      <w:proofErr w:type="spellEnd"/>
-      <w:r>
-        <w:t xml:space="preserve">, smoothed=1761311994439.823 </w:t>
-      </w:r>
-      <w:proofErr w:type="spellStart"/>
-      <w:r>
-        <w:t>ms</w:t>
-      </w:r>
-      <w:proofErr w:type="spellEnd"/>
-      <w:r>
-        <w:t xml:space="preserve">, delay=9.474 </w:t>
-      </w:r>
-      <w:proofErr w:type="spellStart"/>
-      <w:r>
-        <w:t>ms</w:t>
-      </w:r>
-      <w:proofErr w:type="spellEnd"/>
+        <w:t>09:20:41.858 -&gt; Sync: offset=1761311994438.293 ms, smoothed=1761311994439.823 ms, delay=9.474 ms</w:t>
+      </w:r>
     </w:p>
     <w:p>
       <w:r>
@@ -1308,29 +1016,8 @@
     </w:p>
     <w:p>
       <w:r>
-        <w:t xml:space="preserve">09:20:42.948 -&gt; Sync: offset=1761311994437.480 </w:t>
-      </w:r>
-      <w:proofErr w:type="spellStart"/>
-      <w:r>
-        <w:t>ms</w:t>
-      </w:r>
-      <w:proofErr w:type="spellEnd"/>
-      <w:r>
-        <w:t xml:space="preserve">, smoothed=1761311994439.745 </w:t>
-      </w:r>
-      <w:proofErr w:type="spellStart"/>
-      <w:r>
-        <w:t>ms</w:t>
-      </w:r>
-      <w:proofErr w:type="spellEnd"/>
-      <w:r>
-        <w:t xml:space="preserve">, delay=7.701 </w:t>
-      </w:r>
-      <w:proofErr w:type="spellStart"/>
-      <w:r>
-        <w:t>ms</w:t>
-      </w:r>
-      <w:proofErr w:type="spellEnd"/>
+        <w:t>09:20:42.948 -&gt; Sync: offset=1761311994437.480 ms, smoothed=1761311994439.745 ms, delay=7.701 ms</w:t>
+      </w:r>
     </w:p>
     <w:p>
       <w:r>
@@ -1349,29 +1036,8 @@
     </w:p>
     <w:p>
       <w:r>
-        <w:t xml:space="preserve">09:20:43.953 -&gt; Sync: offset=1761311994437.582 </w:t>
-      </w:r>
-      <w:proofErr w:type="spellStart"/>
-      <w:r>
-        <w:t>ms</w:t>
-      </w:r>
-      <w:proofErr w:type="spellEnd"/>
-      <w:r>
-        <w:t xml:space="preserve">, smoothed=1761311994439.702 </w:t>
-      </w:r>
-      <w:proofErr w:type="spellStart"/>
-      <w:r>
-        <w:t>ms</w:t>
-      </w:r>
-      <w:proofErr w:type="spellEnd"/>
-      <w:r>
-        <w:t xml:space="preserve">, delay=8.490 </w:t>
-      </w:r>
-      <w:proofErr w:type="spellStart"/>
-      <w:r>
-        <w:t>ms</w:t>
-      </w:r>
-      <w:proofErr w:type="spellEnd"/>
+        <w:t>09:20:43.953 -&gt; Sync: offset=1761311994437.582 ms, smoothed=1761311994439.702 ms, delay=8.490 ms</w:t>
+      </w:r>
     </w:p>
     <w:p>
       <w:r>
@@ -1390,29 +1056,8 @@
     </w:p>
     <w:p>
       <w:r>
-        <w:t xml:space="preserve">09:20:44.937 -&gt; Sync: offset=1761311994436.826 </w:t>
-      </w:r>
-      <w:proofErr w:type="spellStart"/>
-      <w:r>
-        <w:t>ms</w:t>
-      </w:r>
-      <w:proofErr w:type="spellEnd"/>
-      <w:r>
-        <w:t xml:space="preserve">, smoothed=1761311994439.634 </w:t>
-      </w:r>
-      <w:proofErr w:type="spellStart"/>
-      <w:r>
-        <w:t>ms</w:t>
-      </w:r>
-      <w:proofErr w:type="spellEnd"/>
-      <w:r>
-        <w:t xml:space="preserve">, delay=11.934 </w:t>
-      </w:r>
-      <w:proofErr w:type="spellStart"/>
-      <w:r>
-        <w:t>ms</w:t>
-      </w:r>
-      <w:proofErr w:type="spellEnd"/>
+        <w:t>09:20:44.937 -&gt; Sync: offset=1761311994436.826 ms, smoothed=1761311994439.634 ms, delay=11.934 ms</w:t>
+      </w:r>
     </w:p>
     <w:p>
       <w:r>
@@ -1431,29 +1076,8 @@
     </w:p>
     <w:p>
       <w:r>
-        <w:t xml:space="preserve">09:20:45.962 -&gt; Sync: offset=1761311994439.557 </w:t>
-      </w:r>
-      <w:proofErr w:type="spellStart"/>
-      <w:r>
-        <w:t>ms</w:t>
-      </w:r>
-      <w:proofErr w:type="spellEnd"/>
-      <w:r>
-        <w:t xml:space="preserve">, smoothed=1761311994439.657 </w:t>
-      </w:r>
-      <w:proofErr w:type="spellStart"/>
-      <w:r>
-        <w:t>ms</w:t>
-      </w:r>
-      <w:proofErr w:type="spellEnd"/>
-      <w:r>
-        <w:t xml:space="preserve">, delay=12.552 </w:t>
-      </w:r>
-      <w:proofErr w:type="spellStart"/>
-      <w:r>
-        <w:t>ms</w:t>
-      </w:r>
-      <w:proofErr w:type="spellEnd"/>
+        <w:t>09:20:45.962 -&gt; Sync: offset=1761311994439.557 ms, smoothed=1761311994439.657 ms, delay=12.552 ms</w:t>
+      </w:r>
     </w:p>
     <w:p>
       <w:r>
@@ -1493,29 +1117,8 @@
     </w:p>
     <w:p>
       <w:r>
-        <w:t xml:space="preserve">09:20:48.066 -&gt; Sync: offset=1761311994438.451 </w:t>
-      </w:r>
-      <w:proofErr w:type="spellStart"/>
-      <w:r>
-        <w:t>ms</w:t>
-      </w:r>
-      <w:proofErr w:type="spellEnd"/>
-      <w:r>
-        <w:t xml:space="preserve">, smoothed=1761311994439.551 </w:t>
-      </w:r>
-      <w:proofErr w:type="spellStart"/>
-      <w:r>
-        <w:t>ms</w:t>
-      </w:r>
-      <w:proofErr w:type="spellEnd"/>
-      <w:r>
-        <w:t xml:space="preserve">, delay=11.466 </w:t>
-      </w:r>
-      <w:proofErr w:type="spellStart"/>
-      <w:r>
-        <w:t>ms</w:t>
-      </w:r>
-      <w:proofErr w:type="spellEnd"/>
+        <w:t>09:20:48.066 -&gt; Sync: offset=1761311994438.451 ms, smoothed=1761311994439.551 ms, delay=11.466 ms</w:t>
+      </w:r>
     </w:p>
     <w:p>
       <w:r>
@@ -1534,29 +1137,8 @@
     </w:p>
     <w:p>
       <w:r>
-        <w:t xml:space="preserve">09:20:49.076 -&gt; Sync: offset=1761311994437.802 </w:t>
-      </w:r>
-      <w:proofErr w:type="spellStart"/>
-      <w:r>
-        <w:t>ms</w:t>
-      </w:r>
-      <w:proofErr w:type="spellEnd"/>
-      <w:r>
-        <w:t xml:space="preserve">, smoothed=1761311994439.495 </w:t>
-      </w:r>
-      <w:proofErr w:type="spellStart"/>
-      <w:r>
-        <w:t>ms</w:t>
-      </w:r>
-      <w:proofErr w:type="spellEnd"/>
-      <w:r>
-        <w:t xml:space="preserve">, delay=9.490 </w:t>
-      </w:r>
-      <w:proofErr w:type="spellStart"/>
-      <w:r>
-        <w:t>ms</w:t>
-      </w:r>
-      <w:proofErr w:type="spellEnd"/>
+        <w:t>09:20:49.076 -&gt; Sync: offset=1761311994437.802 ms, smoothed=1761311994439.495 ms, delay=9.490 ms</w:t>
+      </w:r>
     </w:p>
     <w:p>
       <w:r>
@@ -1577,15 +1159,7 @@
     <w:p/>
     <w:p>
       <w:r>
-        <w:t xml:space="preserve">Conclusion, NTP is </w:t>
-      </w:r>
-      <w:proofErr w:type="spellStart"/>
-      <w:r>
-        <w:t>waaayyyyy</w:t>
-      </w:r>
-      <w:proofErr w:type="spellEnd"/>
-      <w:r>
-        <w:t xml:space="preserve"> worse than GPS PPS. Just from this quick test its around 50 microseconds off every second, which is substantial drift for my application in the timing gates. Time change smoothing is going to be needed, and more research needs to be done to see how well two devices can sync time. As long as they can achieve millisecond accuracy then this method will be acceptable. Clock speed correction might also be needed, but its looking like NTP is too imprecise to do this kind of calculation.</w:t>
+        <w:t>Conclusion, NTP is waaayyyyy worse than GPS PPS. Just from this quick test its around 50 microseconds off every second, which is substantial drift for my application in the timing gates. Time change smoothing is going to be needed, and more research needs to be done to see how well two devices can sync time. As long as they can achieve millisecond accuracy then this method will be acceptable. Clock speed correction might also be needed, but its looking like NTP is too imprecise to do this kind of calculation.</w:t>
       </w:r>
     </w:p>
     <w:p/>
@@ -1597,29 +1171,8 @@
     </w:p>
     <w:p>
       <w:r>
-        <w:t xml:space="preserve">01:29:25.111 -&gt; Sync: offset=1761456213835.237 </w:t>
-      </w:r>
-      <w:proofErr w:type="spellStart"/>
-      <w:r>
-        <w:t>ms</w:t>
-      </w:r>
-      <w:proofErr w:type="spellEnd"/>
-      <w:r>
-        <w:t xml:space="preserve">, smoothed=1761456213836.796 </w:t>
-      </w:r>
-      <w:proofErr w:type="spellStart"/>
-      <w:r>
-        <w:t>ms</w:t>
-      </w:r>
-      <w:proofErr w:type="spellEnd"/>
-      <w:r>
-        <w:t xml:space="preserve">, delay=9.099 </w:t>
-      </w:r>
-      <w:proofErr w:type="spellStart"/>
-      <w:r>
-        <w:t>ms</w:t>
-      </w:r>
-      <w:proofErr w:type="spellEnd"/>
+        <w:t>01:29:25.111 -&gt; Sync: offset=1761456213835.237 ms, smoothed=1761456213836.796 ms, delay=9.099 ms</w:t>
+      </w:r>
     </w:p>
     <w:p>
       <w:r>
@@ -1628,29 +1181,13 @@
     </w:p>
     <w:p>
       <w:r>
-        <w:t xml:space="preserve">01:29:25.111 -&gt; Interval: 1000007, </w:t>
-      </w:r>
-      <w:proofErr w:type="spellStart"/>
-      <w:r>
-        <w:t>GPSMicros</w:t>
-      </w:r>
-      <w:proofErr w:type="spellEnd"/>
-      <w:r>
-        <w:t>: 1761456565000096, Diff: -77643</w:t>
+        <w:t>01:29:25.111 -&gt; Interval: 1000007, GPSMicros: 1761456565000096, Diff: -77643</w:t>
       </w:r>
     </w:p>
     <w:p>
       <w:r>
         <w:lastRenderedPageBreak/>
-        <w:t xml:space="preserve">01:29:26.082 -&gt; Interval: 1000004, </w:t>
-      </w:r>
-      <w:proofErr w:type="spellStart"/>
-      <w:r>
-        <w:t>GPSMicros</w:t>
-      </w:r>
-      <w:proofErr w:type="spellEnd"/>
-      <w:r>
-        <w:t>: 1761456566000183, Diff: -77618</w:t>
+        <w:t>01:29:26.082 -&gt; Interval: 1000004, GPSMicros: 1761456566000183, Diff: -77618</w:t>
       </w:r>
     </w:p>
     <w:p>
@@ -1665,15 +1202,7 @@
     </w:p>
     <w:p>
       <w:r>
-        <w:t xml:space="preserve">01:29:27.088 -&gt; Interval: 1000008, </w:t>
-      </w:r>
-      <w:proofErr w:type="spellStart"/>
-      <w:r>
-        <w:t>GPSMicros</w:t>
-      </w:r>
-      <w:proofErr w:type="spellEnd"/>
-      <w:r>
-        <w:t>: 1761456567000181, Diff: -77573</w:t>
+        <w:t>01:29:27.088 -&gt; Interval: 1000008, GPSMicros: 1761456567000181, Diff: -77573</w:t>
       </w:r>
     </w:p>
     <w:p>
@@ -1698,15 +1227,7 @@
     </w:p>
     <w:p>
       <w:r>
-        <w:t xml:space="preserve">01:29:28.092 -&gt; Interval: 1000005, </w:t>
-      </w:r>
-      <w:proofErr w:type="spellStart"/>
-      <w:r>
-        <w:t>GPSMicros</w:t>
-      </w:r>
-      <w:proofErr w:type="spellEnd"/>
-      <w:r>
-        <w:t>: 1761456568000183, Diff: -77535</w:t>
+        <w:t>01:29:28.092 -&gt; Interval: 1000005, GPSMicros: 1761456568000183, Diff: -77535</w:t>
       </w:r>
     </w:p>
     <w:p>
@@ -1721,29 +1242,8 @@
     </w:p>
     <w:p>
       <w:r>
-        <w:t xml:space="preserve">01:29:28.422 -&gt; Sync: offset=1761456213840.810 </w:t>
-      </w:r>
-      <w:proofErr w:type="spellStart"/>
-      <w:r>
-        <w:t>ms</w:t>
-      </w:r>
-      <w:proofErr w:type="spellEnd"/>
-      <w:r>
-        <w:t xml:space="preserve">, smoothed=1761456213836.752 </w:t>
-      </w:r>
-      <w:proofErr w:type="spellStart"/>
-      <w:r>
-        <w:t>ms</w:t>
-      </w:r>
-      <w:proofErr w:type="spellEnd"/>
-      <w:r>
-        <w:t xml:space="preserve">, delay=21.928 </w:t>
-      </w:r>
-      <w:proofErr w:type="spellStart"/>
-      <w:r>
-        <w:t>ms</w:t>
-      </w:r>
-      <w:proofErr w:type="spellEnd"/>
+        <w:t>01:29:28.422 -&gt; Sync: offset=1761456213840.810 ms, smoothed=1761456213836.752 ms, delay=21.928 ms</w:t>
+      </w:r>
     </w:p>
     <w:p>
       <w:r>
@@ -1752,42 +1252,13 @@
     </w:p>
     <w:p>
       <w:r>
-        <w:t xml:space="preserve">01:29:29.104 -&gt; Interval: 1000006, </w:t>
-      </w:r>
-      <w:proofErr w:type="spellStart"/>
-      <w:r>
-        <w:t>GPSMicros</w:t>
-      </w:r>
-      <w:proofErr w:type="spellEnd"/>
-      <w:r>
-        <w:t>: 1761456569000183, Diff: -77497</w:t>
-      </w:r>
-    </w:p>
-    <w:p>
-      <w:r>
-        <w:t xml:space="preserve">01:29:29.423 -&gt; Sync: offset=1761456213833.554 </w:t>
-      </w:r>
-      <w:proofErr w:type="spellStart"/>
-      <w:r>
-        <w:t>ms</w:t>
-      </w:r>
-      <w:proofErr w:type="spellEnd"/>
-      <w:r>
-        <w:t xml:space="preserve">, smoothed=1761456213836.489 </w:t>
-      </w:r>
-      <w:proofErr w:type="spellStart"/>
-      <w:r>
-        <w:t>ms</w:t>
-      </w:r>
-      <w:proofErr w:type="spellEnd"/>
-      <w:r>
-        <w:t xml:space="preserve">, delay=11.387 </w:t>
-      </w:r>
-      <w:proofErr w:type="spellStart"/>
-      <w:r>
-        <w:t>ms</w:t>
-      </w:r>
-      <w:proofErr w:type="spellEnd"/>
+        <w:t>01:29:29.104 -&gt; Interval: 1000006, GPSMicros: 1761456569000183, Diff: -77497</w:t>
+      </w:r>
+    </w:p>
+    <w:p>
+      <w:r>
+        <w:t>01:29:29.423 -&gt; Sync: offset=1761456213833.554 ms, smoothed=1761456213836.489 ms, delay=11.387 ms</w:t>
+      </w:r>
     </w:p>
     <w:p>
       <w:r>
@@ -1796,42 +1267,13 @@
     </w:p>
     <w:p>
       <w:r>
-        <w:t xml:space="preserve">01:29:30.116 -&gt; Interval: 1000006, </w:t>
-      </w:r>
-      <w:proofErr w:type="spellStart"/>
-      <w:r>
-        <w:t>GPSMicros</w:t>
-      </w:r>
-      <w:proofErr w:type="spellEnd"/>
-      <w:r>
-        <w:t>: 1761456570000184, Diff: -77418</w:t>
-      </w:r>
-    </w:p>
-    <w:p>
-      <w:r>
-        <w:t xml:space="preserve">01:29:30.402 -&gt; Sync: offset=1761456213834.844 </w:t>
-      </w:r>
-      <w:proofErr w:type="spellStart"/>
-      <w:r>
-        <w:t>ms</w:t>
-      </w:r>
-      <w:proofErr w:type="spellEnd"/>
-      <w:r>
-        <w:t xml:space="preserve">, smoothed=1761456213836.390 </w:t>
-      </w:r>
-      <w:proofErr w:type="spellStart"/>
-      <w:r>
-        <w:t>ms</w:t>
-      </w:r>
-      <w:proofErr w:type="spellEnd"/>
-      <w:r>
-        <w:t xml:space="preserve">, delay=8.363 </w:t>
-      </w:r>
-      <w:proofErr w:type="spellStart"/>
-      <w:r>
-        <w:t>ms</w:t>
-      </w:r>
-      <w:proofErr w:type="spellEnd"/>
+        <w:t>01:29:30.116 -&gt; Interval: 1000006, GPSMicros: 1761456570000184, Diff: -77418</w:t>
+      </w:r>
+    </w:p>
+    <w:p>
+      <w:r>
+        <w:t>01:29:30.402 -&gt; Sync: offset=1761456213834.844 ms, smoothed=1761456213836.390 ms, delay=8.363 ms</w:t>
+      </w:r>
     </w:p>
     <w:p>
       <w:r>
@@ -1840,15 +1282,7 @@
     </w:p>
     <w:p>
       <w:r>
-        <w:t xml:space="preserve">01:29:31.109 -&gt; Interval: 1000007, </w:t>
-      </w:r>
-      <w:proofErr w:type="spellStart"/>
-      <w:r>
-        <w:t>GPSMicros</w:t>
-      </w:r>
-      <w:proofErr w:type="spellEnd"/>
-      <w:r>
-        <w:t>: 1761456571000182, Diff: -77337</w:t>
+        <w:t>01:29:31.109 -&gt; Interval: 1000007, GPSMicros: 1761456571000182, Diff: -77337</w:t>
       </w:r>
     </w:p>
     <w:p>
@@ -1863,15 +1297,7 @@
     </w:p>
     <w:p>
       <w:r>
-        <w:t xml:space="preserve">01:29:32.100 -&gt; Interval: 1000005, </w:t>
-      </w:r>
-      <w:proofErr w:type="spellStart"/>
-      <w:r>
-        <w:t>GPSMicros</w:t>
-      </w:r>
-      <w:proofErr w:type="spellEnd"/>
-      <w:r>
-        <w:t>: 1761456572000180, Diff: -77271</w:t>
+        <w:t>01:29:32.100 -&gt; Interval: 1000005, GPSMicros: 1761456572000180, Diff: -77271</w:t>
       </w:r>
     </w:p>
     <w:p>
@@ -1897,15 +1323,7 @@
     </w:p>
     <w:p>
       <w:r>
-        <w:t xml:space="preserve">01:29:33.082 -&gt; Interval: 1000007, </w:t>
-      </w:r>
-      <w:proofErr w:type="spellStart"/>
-      <w:r>
-        <w:t>GPSMicros</w:t>
-      </w:r>
-      <w:proofErr w:type="spellEnd"/>
-      <w:r>
-        <w:t>: 1761456573000175, Diff: -77221</w:t>
+        <w:t>01:29:33.082 -&gt; Interval: 1000007, GPSMicros: 1761456573000175, Diff: -77221</w:t>
       </w:r>
     </w:p>
     <w:p>
@@ -1920,29 +1338,8 @@
     </w:p>
     <w:p>
       <w:r>
-        <w:t xml:space="preserve">01:29:33.745 -&gt; Sync: offset=1761456213836.715 </w:t>
-      </w:r>
-      <w:proofErr w:type="spellStart"/>
-      <w:r>
-        <w:t>ms</w:t>
-      </w:r>
-      <w:proofErr w:type="spellEnd"/>
-      <w:r>
-        <w:t xml:space="preserve">, smoothed=1761456213836.272 </w:t>
-      </w:r>
-      <w:proofErr w:type="spellStart"/>
-      <w:r>
-        <w:t>ms</w:t>
-      </w:r>
-      <w:proofErr w:type="spellEnd"/>
-      <w:r>
-        <w:t xml:space="preserve">, delay=19.253 </w:t>
-      </w:r>
-      <w:proofErr w:type="spellStart"/>
-      <w:r>
-        <w:t>ms</w:t>
-      </w:r>
-      <w:proofErr w:type="spellEnd"/>
+        <w:t>01:29:33.745 -&gt; Sync: offset=1761456213836.715 ms, smoothed=1761456213836.272 ms, delay=19.253 ms</w:t>
+      </w:r>
     </w:p>
     <w:p>
       <w:r>
@@ -2096,13 +1493,8 @@
     </w:p>
     <w:p>
       <w:r>
-        <w:t xml:space="preserve">MCU included, UART connection with AT messages, 915mhz only, included </w:t>
-      </w:r>
-      <w:proofErr w:type="spellStart"/>
-      <w:r>
-        <w:t>intenna</w:t>
-      </w:r>
-      <w:proofErr w:type="spellEnd"/>
+        <w:t>MCU included, UART connection with AT messages, 915mhz only, included intenna</w:t>
+      </w:r>
     </w:p>
     <w:p/>
     <w:p/>
@@ -2188,13 +1580,8 @@
       <w:r>
         <w:t xml:space="preserve">Settings: </w:t>
       </w:r>
-      <w:proofErr w:type="spellStart"/>
-      <w:r>
-        <w:t>send_at</w:t>
-      </w:r>
-      <w:proofErr w:type="spellEnd"/>
-      <w:r>
-        <w:t>("AT+PARAMETER=7,9,1,8")  # SF7, BW500k, CR4/5, preamble=8</w:t>
+      <w:r>
+        <w:t>send_at("AT+PARAMETER=7,9,1,8")  # SF7, BW500k, CR4/5, preamble=8</w:t>
       </w:r>
     </w:p>
     <w:p>
@@ -2250,13 +1637,8 @@
         <w:t xml:space="preserve">At 40 seconds switched from original message to </w:t>
       </w:r>
       <w:r>
-        <w:t>SEQ=985=</w:t>
-      </w:r>
-      <w:proofErr w:type="spellStart"/>
-      <w:r>
-        <w:t>TTTTTTTTTttttttttTTTTTTTTtttttttt</w:t>
-      </w:r>
-      <w:proofErr w:type="spellEnd"/>
+        <w:t>SEQ=985=TTTTTTTTTttttttttTTTTTTTTtttttttt</w:t>
+      </w:r>
     </w:p>
     <w:p>
       <w:r>
@@ -2761,23 +2143,7 @@
     <w:p>
       <w:r>
         <w:lastRenderedPageBreak/>
-        <w:t xml:space="preserve">First line is when my body got out of the sightline, second line is when it went around the corner at Jonas </w:t>
-      </w:r>
-      <w:proofErr w:type="spellStart"/>
-      <w:r>
-        <w:t>ave</w:t>
-      </w:r>
-      <w:proofErr w:type="spellEnd"/>
-      <w:r>
-        <w:t xml:space="preserve"> and lost all sightline </w:t>
-      </w:r>
-      <w:proofErr w:type="spellStart"/>
-      <w:r>
-        <w:t>bc</w:t>
-      </w:r>
-      <w:proofErr w:type="spellEnd"/>
-      <w:r>
-        <w:t xml:space="preserve"> of a truck, house, and hill</w:t>
+        <w:t>First line is when my body got out of the sightline, second line is when it went around the corner at Jonas ave and lost all sightline bc of a truck, house, and hill</w:t>
       </w:r>
     </w:p>
     <w:p/>
@@ -3305,19 +2671,9 @@
             <w:hideMark/>
           </w:tcPr>
           <w:p>
-            <w:proofErr w:type="spellStart"/>
-            <w:r>
-              <w:t>enum</w:t>
-            </w:r>
-            <w:proofErr w:type="spellEnd"/>
-            <w:r>
-              <w:t>/</w:t>
-            </w:r>
-            <w:proofErr w:type="spellStart"/>
-            <w:r>
-              <w:t>cmd</w:t>
-            </w:r>
-            <w:proofErr w:type="spellEnd"/>
+            <w:r>
+              <w:t>enum/cmd</w:t>
+            </w:r>
           </w:p>
         </w:tc>
         <w:tc>
@@ -3526,13 +2882,8 @@
           </w:tcPr>
           <w:p>
             <w:r>
-              <w:t xml:space="preserve">Message type </w:t>
-            </w:r>
-            <w:proofErr w:type="spellStart"/>
-            <w:r>
-              <w:t>enum</w:t>
-            </w:r>
-            <w:proofErr w:type="spellEnd"/>
+              <w:t>Message type enum</w:t>
+            </w:r>
           </w:p>
         </w:tc>
         <w:tc>
@@ -4214,15 +3565,7 @@
         </w:numPr>
       </w:pPr>
       <w:r>
-        <w:t>reset's/bootups terminate with "</w:t>
-      </w:r>
-      <w:proofErr w:type="spellStart"/>
-      <w:r>
-        <w:t>init</w:t>
-      </w:r>
-      <w:proofErr w:type="spellEnd"/>
-      <w:r>
-        <w:t xml:space="preserve"> failed" messages</w:t>
+        <w:t>reset's/bootups terminate with "init failed" messages</w:t>
       </w:r>
     </w:p>
     <w:p>
@@ -4301,15 +3644,7 @@
         </w:r>
       </w:hyperlink>
       <w:r>
-        <w:t xml:space="preserve"> driver interrupt service routine reads status from and writes data to the </w:t>
-      </w:r>
-      <w:proofErr w:type="spellStart"/>
-      <w:r>
-        <w:t>the</w:t>
-      </w:r>
-      <w:proofErr w:type="spellEnd"/>
-      <w:r>
-        <w:t xml:space="preserve"> RFM module via the SPI interface. It is very important therefore, that if you are using the </w:t>
+        <w:t> driver interrupt service routine reads status from and writes data to the the RFM module via the SPI interface. It is very important therefore, that if you are using the </w:t>
       </w:r>
       <w:hyperlink r:id="rId36" w:tooltip="Driver to send and receive unaddressed, unreliable datagrams via a LoRa capable radio transceiver." w:history="1">
         <w:r>
@@ -4322,15 +3657,7 @@
         </w:r>
       </w:hyperlink>
       <w:r>
-        <w:t xml:space="preserve"> driver with another SPI based </w:t>
-      </w:r>
-      <w:proofErr w:type="spellStart"/>
-      <w:r>
-        <w:t>deviced</w:t>
-      </w:r>
-      <w:proofErr w:type="spellEnd"/>
-      <w:r>
-        <w:t>, that you disable interrupts while you transfer data to and from that other device. Use cli() to disable interrupts and sei() to reenable them.</w:t>
+        <w:t> driver with another SPI based deviced, that you disable interrupts while you transfer data to and from that other device. Use cli() to disable interrupts and sei() to reenable them.</w:t>
       </w:r>
     </w:p>
     <w:p>
@@ -4363,15 +3690,7 @@
         </w:r>
       </w:hyperlink>
       <w:r>
-        <w:t xml:space="preserve"> driver requires non-trivial amounts of memory. The sample programs all compile to about 8kbytes each, which will fit in the flash </w:t>
-      </w:r>
-      <w:proofErr w:type="spellStart"/>
-      <w:r>
-        <w:t>proram</w:t>
-      </w:r>
-      <w:proofErr w:type="spellEnd"/>
-      <w:r>
-        <w:t xml:space="preserve"> memory of most Arduinos. </w:t>
+        <w:t xml:space="preserve"> driver requires non-trivial amounts of memory. The sample programs all compile to about 8kbytes each, which will fit in the flash proram memory of most Arduinos. </w:t>
       </w:r>
       <w:r>
         <w:lastRenderedPageBreak/>
@@ -4415,15 +3734,7 @@
         </w:numPr>
       </w:pPr>
       <w:r>
-        <w:t xml:space="preserve">Changes in </w:t>
-      </w:r>
-      <w:proofErr w:type="spellStart"/>
-      <w:r>
-        <w:t>behaviour</w:t>
-      </w:r>
-      <w:proofErr w:type="spellEnd"/>
-      <w:r>
-        <w:t xml:space="preserve"> when seemingly unrelated changes are made (such as adding print() statements)</w:t>
+        <w:t>Changes in behaviour when seemingly unrelated changes are made (such as adding print() statements)</w:t>
       </w:r>
     </w:p>
     <w:p>
@@ -4445,15 +3756,7 @@
         </w:numPr>
       </w:pPr>
       <w:r>
-        <w:t xml:space="preserve">Output from </w:t>
-      </w:r>
-      <w:proofErr w:type="spellStart"/>
-      <w:r>
-        <w:t>Serial.print</w:t>
-      </w:r>
-      <w:proofErr w:type="spellEnd"/>
-      <w:r>
-        <w:t>() not appearing</w:t>
+        <w:t>Output from Serial.print() not appearing</w:t>
       </w:r>
     </w:p>
     <w:p/>
@@ -4470,8 +3773,24 @@
       <w:r>
         <w:br/>
       </w:r>
-      <w:r>
-        <w:t>https://github.com/rosmod/lib-vectornav/tree/master/src/vectornav/include/vectornav</w:t>
+      <w:hyperlink r:id="rId39" w:history="1">
+        <w:r>
+          <w:rPr>
+            <w:rStyle w:val="Hyperlink"/>
+          </w:rPr>
+          <w:t>https://github.com/rosmod/lib-vectornav/tree/master/src/vectornav/include/vectornav</w:t>
+        </w:r>
+      </w:hyperlink>
+    </w:p>
+    <w:p/>
+    <w:p>
+      <w:r>
+        <w:t>RadioLib RF69 Error Codes</w:t>
+      </w:r>
+    </w:p>
+    <w:p>
+      <w:r>
+        <w:t>https://jgromes.github.io/RadioLib/group__status__codes.html</w:t>
       </w:r>
     </w:p>
     <w:p/>

</xml_diff>